<commit_message>
Doc: ajustes na introdução da documentação
</commit_message>
<xml_diff>
--- a/Documentação.docx
+++ b/Documentação.docx
@@ -1266,726 +1266,890 @@
           <w:bCs/>
         </w:rPr>
         <w:lastRenderedPageBreak/>
-        <w:t>ABS</w:t>
+        <w:t>ABSTRACT</w:t>
+      </w:r>
+    </w:p>
+    <w:p>
+      <w:pPr>
+        <w:spacing w:after="0" w:line="360" w:lineRule="auto"/>
+        <w:ind w:firstLine="283"/>
+        <w:contextualSpacing/>
+        <w:jc w:val="both"/>
+        <w:rPr>
+          <w:rFonts w:ascii="Arial" w:eastAsia="Arial" w:hAnsi="Arial" w:cs="Arial"/>
+        </w:rPr>
+      </w:pPr>
+      <w:r>
+        <w:rPr>
+          <w:rFonts w:ascii="Arial" w:eastAsia="Arial" w:hAnsi="Arial" w:cs="Arial"/>
+        </w:rPr>
+        <w:t>The project aims to develop a dashboard focused on the agronomy sector, functioning as a centralized panel capable of transforming operational data into clear and intuitive visual indicators.</w:t>
+      </w:r>
+    </w:p>
+    <w:p>
+      <w:pPr>
+        <w:spacing w:after="0" w:line="360" w:lineRule="auto"/>
+        <w:ind w:firstLine="283"/>
+        <w:contextualSpacing/>
+        <w:jc w:val="both"/>
+      </w:pPr>
+      <w:r>
+        <w:rPr>
+          <w:rFonts w:ascii="Arial" w:eastAsia="Arial" w:hAnsi="Arial" w:cs="Arial"/>
+          <w:lang w:val="en-US"/>
+        </w:rPr>
+        <w:t>The tool will allow for organized and efficient monitoring of information related to products, employees, clients, sales, profits, and costs. This structured visualization will facilitate more strategic management, based on precise analyses rather than assumptions. Furthermore, the dashboard will help identify consumption patterns, seasonality, sales performance by period, and team productivity, offering a more complete understanding of the commercial landscape.</w:t>
+      </w:r>
+    </w:p>
+    <w:p>
+      <w:pPr>
+        <w:spacing w:after="0" w:line="360" w:lineRule="auto"/>
+        <w:ind w:firstLine="283"/>
+        <w:contextualSpacing/>
+        <w:jc w:val="both"/>
+      </w:pPr>
+      <w:r>
+        <w:rPr>
+          <w:rFonts w:ascii="Arial" w:eastAsia="Arial" w:hAnsi="Arial" w:cs="Arial"/>
+        </w:rPr>
+        <w:t>The system will also include filtering and comparison features, enabling detailed analyses by category, region, period, or product type. This flexibility will expand monitoring capacity and make goal tracking more efficient. Centralizing information will reduce the time spent searching for scattered data, increasing the agility of administrative routines.</w:t>
+      </w:r>
+    </w:p>
+    <w:p>
+      <w:pPr>
+        <w:spacing w:after="0" w:line="360" w:lineRule="auto"/>
+        <w:ind w:firstLine="283"/>
+        <w:contextualSpacing/>
+        <w:jc w:val="both"/>
+      </w:pPr>
+      <w:r>
+        <w:rPr>
+          <w:rFonts w:ascii="Arial" w:eastAsia="Arial" w:hAnsi="Arial" w:cs="Arial"/>
+          <w:lang w:val="en-US"/>
+        </w:rPr>
+        <w:t>Thus, the dashboard will improve managerial control, strengthen decision-making, and contribute to optimizing commercial performance in the agronomic context.</w:t>
+      </w:r>
+    </w:p>
+    <w:p>
+      <w:pPr>
+        <w:spacing w:after="0" w:line="360" w:lineRule="auto"/>
+        <w:ind w:firstLine="283"/>
+        <w:contextualSpacing/>
+        <w:jc w:val="both"/>
+        <w:rPr>
+          <w:rFonts w:ascii="Arial" w:eastAsia="Arial" w:hAnsi="Arial" w:cs="Arial"/>
+          <w:lang w:val="en-US"/>
+        </w:rPr>
+      </w:pPr>
+    </w:p>
+    <w:p>
+      <w:pPr>
+        <w:spacing w:after="0" w:line="360" w:lineRule="auto"/>
+        <w:ind w:firstLine="283"/>
+        <w:contextualSpacing/>
+        <w:jc w:val="both"/>
+        <w:rPr>
+          <w:rFonts w:ascii="Arial" w:eastAsia="Arial" w:hAnsi="Arial" w:cs="Arial"/>
+          <w:b/>
+          <w:bCs/>
+          <w:lang w:val="en-US"/>
+        </w:rPr>
+      </w:pPr>
+      <w:r>
+        <w:rPr>
+          <w:rFonts w:ascii="Arial" w:eastAsia="Arial" w:hAnsi="Arial" w:cs="Arial"/>
+          <w:b/>
+          <w:bCs/>
+          <w:lang w:val="en-US"/>
+        </w:rPr>
+        <w:t>Keywords:</w:t>
+      </w:r>
+      <w:r>
+        <w:rPr>
+          <w:rFonts w:ascii="Arial" w:eastAsia="Arial" w:hAnsi="Arial" w:cs="Arial"/>
+          <w:b/>
+          <w:bCs/>
+          <w:lang w:val="en-US"/>
+        </w:rPr>
+        <w:t xml:space="preserve"> </w:t>
+      </w:r>
+      <w:r>
+        <w:rPr>
+          <w:rFonts w:ascii="Arial" w:eastAsia="Arial" w:hAnsi="Arial" w:cs="Arial"/>
+          <w:lang w:val="en-US"/>
+        </w:rPr>
+        <w:t>Agronomy, Development, Dashboard, Optimization</w:t>
+      </w:r>
+    </w:p>
+    <w:p>
+      <w:pPr>
+        <w:spacing w:after="0" w:line="360" w:lineRule="auto"/>
+        <w:ind w:firstLine="283"/>
+        <w:contextualSpacing/>
+        <w:jc w:val="both"/>
+        <w:rPr>
+          <w:rFonts w:ascii="Arial" w:eastAsia="Arial" w:hAnsi="Arial" w:cs="Arial"/>
+          <w:lang w:val="en-US"/>
+        </w:rPr>
+      </w:pPr>
+    </w:p>
+    <w:p>
+      <w:pPr>
+        <w:spacing w:after="0" w:line="360" w:lineRule="auto"/>
+        <w:ind w:firstLine="283"/>
+        <w:contextualSpacing/>
+        <w:jc w:val="both"/>
+        <w:rPr>
+          <w:rFonts w:ascii="Arial" w:eastAsia="Arial" w:hAnsi="Arial" w:cs="Arial"/>
+          <w:lang w:val="en-US"/>
+        </w:rPr>
+      </w:pPr>
+    </w:p>
+    <w:p>
+      <w:pPr>
+        <w:spacing w:after="0" w:line="360" w:lineRule="auto"/>
+        <w:ind w:firstLine="283"/>
+        <w:contextualSpacing/>
+        <w:jc w:val="both"/>
+        <w:rPr>
+          <w:rFonts w:ascii="Arial" w:eastAsia="Arial" w:hAnsi="Arial" w:cs="Arial"/>
+          <w:lang w:val="en-US"/>
+        </w:rPr>
+      </w:pPr>
+    </w:p>
+    <w:p>
+      <w:pPr>
+        <w:spacing w:after="0" w:line="360" w:lineRule="auto"/>
+        <w:ind w:firstLine="283"/>
+        <w:contextualSpacing/>
+        <w:jc w:val="both"/>
+        <w:rPr>
+          <w:rFonts w:ascii="Arial" w:eastAsia="Arial" w:hAnsi="Arial" w:cs="Arial"/>
+          <w:lang w:val="en-US"/>
+        </w:rPr>
+      </w:pPr>
+    </w:p>
+    <w:p>
+      <w:pPr>
+        <w:spacing w:after="0" w:line="360" w:lineRule="auto"/>
+        <w:ind w:firstLine="283"/>
+        <w:contextualSpacing/>
+        <w:jc w:val="both"/>
+        <w:rPr>
+          <w:rFonts w:ascii="Arial" w:eastAsia="Arial" w:hAnsi="Arial" w:cs="Arial"/>
+          <w:lang w:val="en-US"/>
+        </w:rPr>
+      </w:pPr>
+    </w:p>
+    <w:p>
+      <w:pPr>
+        <w:spacing w:after="0" w:line="360" w:lineRule="auto"/>
+        <w:ind w:firstLine="283"/>
+        <w:contextualSpacing/>
+        <w:jc w:val="both"/>
+        <w:rPr>
+          <w:rFonts w:ascii="Arial" w:eastAsia="Arial" w:hAnsi="Arial" w:cs="Arial"/>
+          <w:lang w:val="en-US"/>
+        </w:rPr>
+      </w:pPr>
+    </w:p>
+    <w:p>
+      <w:pPr>
+        <w:spacing w:after="0" w:line="360" w:lineRule="auto"/>
+        <w:ind w:firstLine="283"/>
+        <w:contextualSpacing/>
+        <w:jc w:val="both"/>
+        <w:rPr>
+          <w:rFonts w:ascii="Arial" w:eastAsia="Arial" w:hAnsi="Arial" w:cs="Arial"/>
+          <w:lang w:val="en-US"/>
+        </w:rPr>
+      </w:pPr>
+    </w:p>
+    <w:p>
+      <w:pPr>
+        <w:spacing w:after="0" w:line="360" w:lineRule="auto"/>
+        <w:ind w:firstLine="283"/>
+        <w:contextualSpacing/>
+        <w:jc w:val="both"/>
+        <w:rPr>
+          <w:rFonts w:ascii="Arial" w:eastAsia="Arial" w:hAnsi="Arial" w:cs="Arial"/>
+          <w:lang w:val="en-US"/>
+        </w:rPr>
+      </w:pPr>
+    </w:p>
+    <w:p>
+      <w:pPr>
+        <w:spacing w:after="0" w:line="360" w:lineRule="auto"/>
+        <w:ind w:firstLine="283"/>
+        <w:contextualSpacing/>
+        <w:jc w:val="both"/>
+        <w:rPr>
+          <w:rFonts w:ascii="Arial" w:eastAsia="Arial" w:hAnsi="Arial" w:cs="Arial"/>
+          <w:lang w:val="en-US"/>
+        </w:rPr>
+      </w:pPr>
+    </w:p>
+    <w:p>
+      <w:pPr>
+        <w:spacing w:after="0" w:line="360" w:lineRule="auto"/>
+        <w:ind w:firstLine="283"/>
+        <w:contextualSpacing/>
+        <w:jc w:val="both"/>
+        <w:rPr>
+          <w:rFonts w:ascii="Arial" w:eastAsia="Arial" w:hAnsi="Arial" w:cs="Arial"/>
+          <w:lang w:val="en-US"/>
+        </w:rPr>
+      </w:pPr>
+    </w:p>
+    <w:p>
+      <w:pPr>
+        <w:spacing w:after="0" w:line="360" w:lineRule="auto"/>
+        <w:ind w:firstLine="283"/>
+        <w:contextualSpacing/>
+        <w:jc w:val="both"/>
+        <w:rPr>
+          <w:rFonts w:ascii="Arial" w:eastAsia="Arial" w:hAnsi="Arial" w:cs="Arial"/>
+          <w:lang w:val="en-US"/>
+        </w:rPr>
+      </w:pPr>
+    </w:p>
+    <w:p>
+      <w:pPr>
+        <w:spacing w:after="0" w:line="360" w:lineRule="auto"/>
+        <w:ind w:firstLine="283"/>
+        <w:contextualSpacing/>
+        <w:jc w:val="both"/>
+        <w:rPr>
+          <w:rFonts w:ascii="Arial" w:eastAsia="Arial" w:hAnsi="Arial" w:cs="Arial"/>
+          <w:lang w:val="en-US"/>
+        </w:rPr>
+      </w:pPr>
+    </w:p>
+    <w:p>
+      <w:pPr>
+        <w:spacing w:after="0" w:line="360" w:lineRule="auto"/>
+        <w:ind w:firstLine="283"/>
+        <w:contextualSpacing/>
+        <w:jc w:val="both"/>
+        <w:rPr>
+          <w:rFonts w:ascii="Arial" w:eastAsia="Arial" w:hAnsi="Arial" w:cs="Arial"/>
+          <w:lang w:val="en-US"/>
+        </w:rPr>
+      </w:pPr>
+    </w:p>
+    <w:p>
+      <w:pPr>
+        <w:spacing w:after="0" w:line="360" w:lineRule="auto"/>
+        <w:ind w:firstLine="283"/>
+        <w:contextualSpacing/>
+        <w:jc w:val="both"/>
+        <w:rPr>
+          <w:rFonts w:ascii="Arial" w:eastAsia="Arial" w:hAnsi="Arial" w:cs="Arial"/>
+          <w:lang w:val="en-US"/>
+        </w:rPr>
+      </w:pPr>
+    </w:p>
+    <w:p>
+      <w:pPr>
+        <w:spacing w:after="0" w:line="360" w:lineRule="auto"/>
+        <w:ind w:firstLine="283"/>
+        <w:contextualSpacing/>
+        <w:jc w:val="both"/>
+        <w:rPr>
+          <w:rFonts w:ascii="Arial" w:eastAsia="Arial" w:hAnsi="Arial" w:cs="Arial"/>
+          <w:lang w:val="en-US"/>
+        </w:rPr>
+      </w:pPr>
+    </w:p>
+    <w:p>
+      <w:pPr>
+        <w:pStyle w:val="Ttulo"/>
+        <w:ind w:left="283"/>
+        <w:jc w:val="center"/>
+        <w:rPr>
+          <w:rFonts w:ascii="Arial" w:eastAsia="Arial" w:hAnsi="Arial" w:cs="Arial"/>
+          <w:b/>
+          <w:bCs/>
+          <w:sz w:val="28"/>
+          <w:szCs w:val="28"/>
+          <w:lang w:val="en-US"/>
+        </w:rPr>
+      </w:pPr>
+      <w:r>
+        <w:rPr>
+          <w:rFonts w:ascii="Arial" w:eastAsia="Arial" w:hAnsi="Arial" w:cs="Arial"/>
+          <w:b/>
+          <w:bCs/>
+          <w:sz w:val="28"/>
+          <w:szCs w:val="28"/>
+          <w:lang w:val="en-US"/>
+        </w:rPr>
+        <w:lastRenderedPageBreak/>
+        <w:t>SUMÁRIO</w:t>
+      </w:r>
+    </w:p>
+    <w:p>
+      <w:pPr>
+        <w:spacing w:after="0" w:line="360" w:lineRule="auto"/>
+        <w:ind w:firstLine="283"/>
+        <w:contextualSpacing/>
+        <w:jc w:val="center"/>
+        <w:rPr>
+          <w:rFonts w:ascii="Arial" w:eastAsia="Arial" w:hAnsi="Arial" w:cs="Arial"/>
+          <w:b/>
+          <w:bCs/>
+          <w:lang w:val="en-US"/>
+        </w:rPr>
+      </w:pPr>
+    </w:p>
+    <w:p>
+      <w:pPr>
+        <w:pStyle w:val="PargrafodaLista"/>
+        <w:rPr>
+          <w:lang w:val="en-US"/>
+        </w:rPr>
+      </w:pPr>
+    </w:p>
+    <w:p>
+      <w:pPr>
+        <w:pStyle w:val="PargrafodaLista"/>
+        <w:rPr>
+          <w:lang w:val="en-US"/>
+        </w:rPr>
+      </w:pPr>
+    </w:p>
+    <w:p>
+      <w:pPr>
+        <w:pStyle w:val="PargrafodaLista"/>
+        <w:rPr>
+          <w:lang w:val="en-US"/>
+        </w:rPr>
+      </w:pPr>
+    </w:p>
+    <w:p>
+      <w:pPr>
+        <w:pStyle w:val="PargrafodaLista"/>
+        <w:rPr>
+          <w:lang w:val="en-US"/>
+        </w:rPr>
+      </w:pPr>
+    </w:p>
+    <w:p>
+      <w:pPr>
+        <w:pStyle w:val="PargrafodaLista"/>
+        <w:rPr>
+          <w:lang w:val="en-US"/>
+        </w:rPr>
+      </w:pPr>
+    </w:p>
+    <w:p>
+      <w:pPr>
+        <w:pStyle w:val="PargrafodaLista"/>
+        <w:rPr>
+          <w:lang w:val="en-US"/>
+        </w:rPr>
+      </w:pPr>
+    </w:p>
+    <w:p>
+      <w:pPr>
+        <w:pStyle w:val="PargrafodaLista"/>
+        <w:rPr>
+          <w:lang w:val="en-US"/>
+        </w:rPr>
+      </w:pPr>
+    </w:p>
+    <w:p>
+      <w:pPr>
+        <w:pStyle w:val="PargrafodaLista"/>
+        <w:rPr>
+          <w:lang w:val="en-US"/>
+        </w:rPr>
+      </w:pPr>
+    </w:p>
+    <w:p>
+      <w:pPr>
+        <w:pStyle w:val="PargrafodaLista"/>
+        <w:rPr>
+          <w:lang w:val="en-US"/>
+        </w:rPr>
+      </w:pPr>
+    </w:p>
+    <w:p>
+      <w:pPr>
+        <w:pStyle w:val="PargrafodaLista"/>
+        <w:rPr>
+          <w:lang w:val="en-US"/>
+        </w:rPr>
+      </w:pPr>
+    </w:p>
+    <w:p>
+      <w:pPr>
+        <w:pStyle w:val="PargrafodaLista"/>
+        <w:rPr>
+          <w:lang w:val="en-US"/>
+        </w:rPr>
+      </w:pPr>
+    </w:p>
+    <w:p>
+      <w:pPr>
+        <w:pStyle w:val="PargrafodaLista"/>
+        <w:rPr>
+          <w:lang w:val="en-US"/>
+        </w:rPr>
+      </w:pPr>
+    </w:p>
+    <w:p>
+      <w:pPr>
+        <w:pStyle w:val="PargrafodaLista"/>
+        <w:rPr>
+          <w:lang w:val="en-US"/>
+        </w:rPr>
+      </w:pPr>
+    </w:p>
+    <w:p>
+      <w:pPr>
+        <w:pStyle w:val="PargrafodaLista"/>
+        <w:rPr>
+          <w:lang w:val="en-US"/>
+        </w:rPr>
+      </w:pPr>
+    </w:p>
+    <w:p>
+      <w:pPr>
+        <w:pStyle w:val="PargrafodaLista"/>
+        <w:rPr>
+          <w:lang w:val="en-US"/>
+        </w:rPr>
+      </w:pPr>
+    </w:p>
+    <w:p>
+      <w:pPr>
+        <w:pStyle w:val="PargrafodaLista"/>
+        <w:rPr>
+          <w:lang w:val="en-US"/>
+        </w:rPr>
+      </w:pPr>
+    </w:p>
+    <w:p>
+      <w:pPr>
+        <w:pStyle w:val="PargrafodaLista"/>
+        <w:rPr>
+          <w:lang w:val="en-US"/>
+        </w:rPr>
+      </w:pPr>
+    </w:p>
+    <w:p>
+      <w:pPr>
+        <w:pStyle w:val="PargrafodaLista"/>
+        <w:rPr>
+          <w:lang w:val="en-US"/>
+        </w:rPr>
+      </w:pPr>
+    </w:p>
+    <w:p>
+      <w:pPr>
+        <w:pStyle w:val="PargrafodaLista"/>
+        <w:rPr>
+          <w:lang w:val="en-US"/>
+        </w:rPr>
+      </w:pPr>
+    </w:p>
+    <w:p>
+      <w:pPr>
+        <w:pStyle w:val="PargrafodaLista"/>
+        <w:rPr>
+          <w:lang w:val="en-US"/>
+        </w:rPr>
+      </w:pPr>
+    </w:p>
+    <w:p>
+      <w:pPr>
+        <w:pStyle w:val="PargrafodaLista"/>
+        <w:rPr>
+          <w:lang w:val="en-US"/>
+        </w:rPr>
+      </w:pPr>
+    </w:p>
+    <w:p>
+      <w:pPr>
+        <w:pStyle w:val="PargrafodaLista"/>
+        <w:rPr>
+          <w:lang w:val="en-US"/>
+        </w:rPr>
+      </w:pPr>
+    </w:p>
+    <w:p>
+      <w:pPr>
+        <w:pStyle w:val="PargrafodaLista"/>
+        <w:rPr>
+          <w:lang w:val="en-US"/>
+        </w:rPr>
+      </w:pPr>
+    </w:p>
+    <w:p>
+      <w:pPr>
+        <w:pStyle w:val="PargrafodaLista"/>
+        <w:rPr>
+          <w:lang w:val="en-US"/>
+        </w:rPr>
+      </w:pPr>
+    </w:p>
+    <w:p>
+      <w:pPr>
+        <w:pStyle w:val="PargrafodaLista"/>
+        <w:rPr>
+          <w:lang w:val="en-US"/>
+        </w:rPr>
+      </w:pPr>
+    </w:p>
+    <w:p>
+      <w:pPr>
+        <w:pStyle w:val="PargrafodaLista"/>
+        <w:rPr>
+          <w:lang w:val="en-US"/>
+        </w:rPr>
+      </w:pPr>
+    </w:p>
+    <w:p>
+      <w:pPr>
+        <w:pStyle w:val="PargrafodaLista"/>
+        <w:rPr>
+          <w:lang w:val="en-US"/>
+        </w:rPr>
+      </w:pPr>
+    </w:p>
+    <w:p>
+      <w:pPr>
+        <w:pStyle w:val="PargrafodaLista"/>
+        <w:rPr>
+          <w:lang w:val="en-US"/>
+        </w:rPr>
+      </w:pPr>
+    </w:p>
+    <w:p>
+      <w:pPr>
+        <w:pStyle w:val="PargrafodaLista"/>
+        <w:rPr>
+          <w:lang w:val="en-US"/>
+        </w:rPr>
+      </w:pPr>
+    </w:p>
+    <w:p>
+      <w:pPr>
+        <w:pStyle w:val="PargrafodaLista"/>
+        <w:rPr>
+          <w:lang w:val="en-US"/>
+        </w:rPr>
+      </w:pPr>
+    </w:p>
+    <w:p>
+      <w:pPr>
+        <w:pStyle w:val="PargrafodaLista"/>
+        <w:rPr>
+          <w:lang w:val="en-US"/>
+        </w:rPr>
+      </w:pPr>
+    </w:p>
+    <w:p>
+      <w:pPr>
+        <w:pStyle w:val="PargrafodaLista"/>
+        <w:rPr>
+          <w:lang w:val="en-US"/>
+        </w:rPr>
+      </w:pPr>
+    </w:p>
+    <w:p>
+      <w:pPr>
+        <w:pStyle w:val="PargrafodaLista"/>
+        <w:rPr>
+          <w:lang w:val="en-US"/>
+        </w:rPr>
+      </w:pPr>
+    </w:p>
+    <w:p>
+      <w:pPr>
+        <w:pStyle w:val="PargrafodaLista"/>
+        <w:rPr>
+          <w:lang w:val="en-US"/>
+        </w:rPr>
+      </w:pPr>
+    </w:p>
+    <w:p>
+      <w:pPr>
+        <w:pStyle w:val="PargrafodaLista"/>
+        <w:rPr>
+          <w:lang w:val="en-US"/>
+        </w:rPr>
+      </w:pPr>
+    </w:p>
+    <w:p>
+      <w:pPr>
+        <w:pStyle w:val="PargrafodaLista"/>
+        <w:rPr>
+          <w:lang w:val="en-US"/>
+        </w:rPr>
+      </w:pPr>
+    </w:p>
+    <w:p>
+      <w:pPr>
+        <w:pStyle w:val="PargrafodaLista"/>
+        <w:rPr>
+          <w:lang w:val="en-US"/>
+        </w:rPr>
+      </w:pPr>
+    </w:p>
+    <w:p>
+      <w:pPr>
+        <w:pStyle w:val="PargrafodaLista"/>
+        <w:rPr>
+          <w:lang w:val="en-US"/>
+        </w:rPr>
+      </w:pPr>
+    </w:p>
+    <w:p>
+      <w:pPr>
+        <w:rPr>
+          <w:lang w:val="en-US"/>
+        </w:rPr>
+      </w:pPr>
+    </w:p>
+    <w:p>
+      <w:pPr>
+        <w:pStyle w:val="Ttulo"/>
+        <w:rPr>
+          <w:rFonts w:ascii="Arial" w:eastAsia="Arial" w:hAnsi="Arial" w:cs="Arial"/>
+          <w:b/>
+          <w:bCs/>
+          <w:sz w:val="28"/>
+          <w:szCs w:val="28"/>
+          <w:lang w:val="en-US"/>
+        </w:rPr>
+      </w:pPr>
+      <w:r>
+        <w:rPr>
+          <w:rFonts w:ascii="Arial" w:eastAsia="Arial" w:hAnsi="Arial" w:cs="Arial"/>
+          <w:b/>
+          <w:bCs/>
+          <w:sz w:val="28"/>
+          <w:szCs w:val="28"/>
+          <w:lang w:val="en-US"/>
+        </w:rPr>
+        <w:t xml:space="preserve">1 </w:t>
+      </w:r>
+      <w:r>
+        <w:rPr>
+          <w:rFonts w:ascii="Arial" w:eastAsia="Arial" w:hAnsi="Arial" w:cs="Arial"/>
+          <w:b/>
+          <w:bCs/>
+          <w:sz w:val="28"/>
+          <w:szCs w:val="28"/>
+          <w:lang w:val="en-US"/>
+        </w:rPr>
+        <w:t>INTRODUÇÃO</w:t>
+      </w:r>
+    </w:p>
+    <w:p>
+      <w:pPr>
+        <w:shd w:val="clear" w:color="auto" w:fill="FFFFFF" w:themeFill="background1"/>
+        <w:spacing w:before="24" w:after="0" w:line="360" w:lineRule="auto"/>
+        <w:ind w:firstLine="283"/>
+        <w:contextualSpacing/>
+        <w:jc w:val="both"/>
+        <w:rPr>
+          <w:rFonts w:ascii="Arial" w:eastAsia="Arial" w:hAnsi="Arial" w:cs="Arial"/>
+          <w:color w:val="222222"/>
+          <w:lang w:val="en-US"/>
+        </w:rPr>
+      </w:pPr>
+      <w:r>
+        <w:rPr>
+          <w:rFonts w:ascii="Arial" w:eastAsia="Arial" w:hAnsi="Arial" w:cs="Arial"/>
+          <w:color w:val="222222"/>
+          <w:lang w:val="en-US"/>
+        </w:rPr>
+        <w:t xml:space="preserve">    </w:t>
+      </w:r>
+      <w:r>
+        <w:rPr>
+          <w:rFonts w:ascii="Arial" w:eastAsia="Arial" w:hAnsi="Arial" w:cs="Arial"/>
+          <w:color w:val="222222"/>
+          <w:lang w:val="en-US"/>
+        </w:rPr>
+        <w:t>Diante da crescente demanda por decisões rápidas e fundamentadas em informações confiáveis, o uso de ferramentas de visualização de dados torna-se essencial para uma gestão comercial eficiente. Nes</w:t>
+      </w:r>
+      <w:r>
+        <w:rPr>
+          <w:rFonts w:ascii="Arial" w:eastAsia="Arial" w:hAnsi="Arial" w:cs="Arial"/>
+          <w:color w:val="222222"/>
+          <w:lang w:val="en-US"/>
+        </w:rPr>
+        <w:t>t</w:t>
+      </w:r>
+      <w:r>
+        <w:rPr>
+          <w:rFonts w:ascii="Arial" w:eastAsia="Arial" w:hAnsi="Arial" w:cs="Arial"/>
+          <w:color w:val="222222"/>
+          <w:lang w:val="en-US"/>
+        </w:rPr>
+        <w:t xml:space="preserve">e </w:t>
+      </w:r>
+      <w:r>
+        <w:rPr>
+          <w:rFonts w:ascii="Arial" w:eastAsia="Arial" w:hAnsi="Arial" w:cs="Arial"/>
+          <w:color w:val="222222"/>
+          <w:lang w:val="en-US"/>
+        </w:rPr>
+        <w:t>contexto</w:t>
+      </w:r>
+      <w:r>
+        <w:rPr>
+          <w:rFonts w:ascii="Arial" w:eastAsia="Arial" w:hAnsi="Arial" w:cs="Arial"/>
+          <w:color w:val="222222"/>
+          <w:lang w:val="en-US"/>
+        </w:rPr>
+        <w:t xml:space="preserve">, </w:t>
+      </w:r>
+      <w:r>
+        <w:rPr>
+          <w:rFonts w:ascii="Arial" w:eastAsia="Arial" w:hAnsi="Arial" w:cs="Arial"/>
+          <w:color w:val="222222"/>
+          <w:lang w:val="en-US"/>
+        </w:rPr>
+        <w:t xml:space="preserve">o </w:t>
+      </w:r>
+      <w:proofErr w:type="spellStart"/>
+      <w:r>
+        <w:rPr>
+          <w:rFonts w:ascii="Arial" w:eastAsia="Arial" w:hAnsi="Arial" w:cs="Arial"/>
+          <w:color w:val="222222"/>
+          <w:lang w:val="en-US"/>
+        </w:rPr>
+        <w:t>atual</w:t>
+      </w:r>
+      <w:proofErr w:type="spellEnd"/>
+      <w:r>
+        <w:rPr>
+          <w:rFonts w:ascii="Arial" w:eastAsia="Arial" w:hAnsi="Arial" w:cs="Arial"/>
+          <w:color w:val="222222"/>
+          <w:lang w:val="en-US"/>
+        </w:rPr>
+        <w:t xml:space="preserve"> </w:t>
+      </w:r>
+      <w:proofErr w:type="spellStart"/>
+      <w:r>
+        <w:rPr>
+          <w:rFonts w:ascii="Arial" w:eastAsia="Arial" w:hAnsi="Arial" w:cs="Arial"/>
+          <w:color w:val="222222"/>
+          <w:lang w:val="en-US"/>
+        </w:rPr>
+        <w:t>projeto</w:t>
+      </w:r>
+      <w:proofErr w:type="spellEnd"/>
+      <w:r>
+        <w:rPr>
+          <w:rFonts w:ascii="Arial" w:eastAsia="Arial" w:hAnsi="Arial" w:cs="Arial"/>
+          <w:color w:val="222222"/>
+          <w:lang w:val="en-US"/>
+        </w:rPr>
+        <w:t xml:space="preserve"> </w:t>
+      </w:r>
+      <w:proofErr w:type="spellStart"/>
+      <w:r>
+        <w:rPr>
+          <w:rFonts w:ascii="Arial" w:eastAsia="Arial" w:hAnsi="Arial" w:cs="Arial"/>
+          <w:color w:val="222222"/>
+          <w:lang w:val="en-US"/>
+        </w:rPr>
+        <w:t>propõe</w:t>
+      </w:r>
+      <w:proofErr w:type="spellEnd"/>
+      <w:r>
+        <w:rPr>
+          <w:rFonts w:ascii="Arial" w:eastAsia="Arial" w:hAnsi="Arial" w:cs="Arial"/>
+          <w:color w:val="222222"/>
+          <w:lang w:val="en-US"/>
+        </w:rPr>
+        <w:t xml:space="preserve"> </w:t>
+      </w:r>
+      <w:proofErr w:type="spellStart"/>
+      <w:r>
+        <w:rPr>
+          <w:rFonts w:ascii="Arial" w:eastAsia="Arial" w:hAnsi="Arial" w:cs="Arial"/>
+          <w:color w:val="222222"/>
+          <w:lang w:val="en-US"/>
+        </w:rPr>
+        <w:t>como</w:t>
+      </w:r>
+      <w:proofErr w:type="spellEnd"/>
+      <w:r>
+        <w:rPr>
+          <w:rFonts w:ascii="Arial" w:eastAsia="Arial" w:hAnsi="Arial" w:cs="Arial"/>
+          <w:color w:val="222222"/>
+          <w:lang w:val="en-US"/>
+        </w:rPr>
+        <w:t xml:space="preserve"> </w:t>
+      </w:r>
+      <w:proofErr w:type="spellStart"/>
+      <w:r>
+        <w:rPr>
+          <w:rFonts w:ascii="Arial" w:eastAsia="Arial" w:hAnsi="Arial" w:cs="Arial"/>
+          <w:color w:val="222222"/>
+          <w:lang w:val="en-US"/>
+        </w:rPr>
+        <w:t>solução</w:t>
+      </w:r>
+      <w:proofErr w:type="spellEnd"/>
+      <w:r>
+        <w:rPr>
+          <w:rFonts w:ascii="Arial" w:eastAsia="Arial" w:hAnsi="Arial" w:cs="Arial"/>
+          <w:color w:val="222222"/>
+          <w:lang w:val="en-US"/>
+        </w:rPr>
+        <w:t xml:space="preserve">, </w:t>
+      </w:r>
+      <w:r>
+        <w:rPr>
+          <w:rFonts w:ascii="Arial" w:eastAsia="Arial" w:hAnsi="Arial" w:cs="Arial"/>
+          <w:color w:val="222222"/>
+          <w:lang w:val="en-US"/>
+        </w:rPr>
+        <w:t xml:space="preserve">o </w:t>
+      </w:r>
+      <w:proofErr w:type="spellStart"/>
+      <w:r>
+        <w:rPr>
+          <w:rFonts w:ascii="Arial" w:eastAsia="Arial" w:hAnsi="Arial" w:cs="Arial"/>
+          <w:color w:val="222222"/>
+          <w:lang w:val="en-US"/>
+        </w:rPr>
+        <w:t>desenvolvimento</w:t>
+      </w:r>
+      <w:proofErr w:type="spellEnd"/>
+      <w:r>
+        <w:rPr>
+          <w:rFonts w:ascii="Arial" w:eastAsia="Arial" w:hAnsi="Arial" w:cs="Arial"/>
+          <w:color w:val="222222"/>
+          <w:lang w:val="en-US"/>
+        </w:rPr>
+        <w:t xml:space="preserve"> de um dashboard</w:t>
+      </w:r>
+      <w:r>
+        <w:rPr>
+          <w:rFonts w:ascii="Arial" w:eastAsia="Arial" w:hAnsi="Arial" w:cs="Arial"/>
+          <w:color w:val="222222"/>
+          <w:lang w:val="en-US"/>
+        </w:rPr>
+        <w:t>,</w:t>
       </w:r>
       <w:bookmarkStart w:id="0" w:name="_GoBack"/>
       <w:bookmarkEnd w:id="0"/>
       <w:r>
         <w:rPr>
           <w:rFonts w:ascii="Arial" w:eastAsia="Arial" w:hAnsi="Arial" w:cs="Arial"/>
-          <w:b/>
-          <w:bCs/>
-        </w:rPr>
-        <w:t>TRACT</w:t>
-      </w:r>
-    </w:p>
-    <w:p>
-      <w:pPr>
-        <w:spacing w:after="0" w:line="360" w:lineRule="auto"/>
-        <w:ind w:firstLine="283"/>
-        <w:contextualSpacing/>
-        <w:jc w:val="both"/>
-        <w:rPr>
-          <w:rFonts w:ascii="Arial" w:eastAsia="Arial" w:hAnsi="Arial" w:cs="Arial"/>
-        </w:rPr>
-      </w:pPr>
-      <w:r>
-        <w:rPr>
-          <w:rFonts w:ascii="Arial" w:eastAsia="Arial" w:hAnsi="Arial" w:cs="Arial"/>
-        </w:rPr>
-        <w:t>The project aims to develop a dashboard focused on the agronomy sector, functioning as a centralized panel capable of transforming operational data into clear and intuitive visual indicators.</w:t>
-      </w:r>
-    </w:p>
-    <w:p>
-      <w:pPr>
-        <w:spacing w:after="0" w:line="360" w:lineRule="auto"/>
-        <w:ind w:firstLine="283"/>
-        <w:contextualSpacing/>
-        <w:jc w:val="both"/>
-      </w:pPr>
-      <w:r>
-        <w:rPr>
-          <w:rFonts w:ascii="Arial" w:eastAsia="Arial" w:hAnsi="Arial" w:cs="Arial"/>
-          <w:lang w:val="en-US"/>
-        </w:rPr>
-        <w:t>The tool will allow for organized and efficient monitoring of information related to products, employees, clients, sales, profits, and costs. This structured visualization will facilitate more strategic management, based on precise analyses rather than assumptions. Furthermore, the dashboard will help identify consumption patterns, seasonality, sales performance by period, and team productivity, offering a more complete understanding of the commercial landscape.</w:t>
-      </w:r>
-    </w:p>
-    <w:p>
-      <w:pPr>
-        <w:spacing w:after="0" w:line="360" w:lineRule="auto"/>
-        <w:ind w:firstLine="283"/>
-        <w:contextualSpacing/>
-        <w:jc w:val="both"/>
-      </w:pPr>
-      <w:r>
-        <w:rPr>
-          <w:rFonts w:ascii="Arial" w:eastAsia="Arial" w:hAnsi="Arial" w:cs="Arial"/>
-        </w:rPr>
-        <w:t>The system will also include filtering and comparison features, enabling detailed analyses by category, region, period, or product type. This flexibility will expand monitoring capacity and make goal tracking more efficient. Centralizing information will reduce the time spent searching for scattered data, increasing the agility of administrative routines.</w:t>
-      </w:r>
-    </w:p>
-    <w:p>
-      <w:pPr>
-        <w:spacing w:after="0" w:line="360" w:lineRule="auto"/>
-        <w:ind w:firstLine="283"/>
-        <w:contextualSpacing/>
-        <w:jc w:val="both"/>
-      </w:pPr>
-      <w:r>
-        <w:rPr>
-          <w:rFonts w:ascii="Arial" w:eastAsia="Arial" w:hAnsi="Arial" w:cs="Arial"/>
-          <w:lang w:val="en-US"/>
-        </w:rPr>
-        <w:t>Thus, the dashboard will improve managerial control, strengthen decision-making, and contribute to optimizing commercial performance in the agronomic context.</w:t>
-      </w:r>
-    </w:p>
-    <w:p>
-      <w:pPr>
-        <w:spacing w:after="0" w:line="360" w:lineRule="auto"/>
-        <w:ind w:firstLine="283"/>
-        <w:contextualSpacing/>
-        <w:jc w:val="both"/>
-        <w:rPr>
-          <w:rFonts w:ascii="Arial" w:eastAsia="Arial" w:hAnsi="Arial" w:cs="Arial"/>
-          <w:lang w:val="en-US"/>
-        </w:rPr>
-      </w:pPr>
-    </w:p>
-    <w:p>
-      <w:pPr>
-        <w:spacing w:after="0" w:line="360" w:lineRule="auto"/>
-        <w:ind w:firstLine="283"/>
-        <w:contextualSpacing/>
-        <w:jc w:val="both"/>
-        <w:rPr>
-          <w:rFonts w:ascii="Arial" w:eastAsia="Arial" w:hAnsi="Arial" w:cs="Arial"/>
-          <w:b/>
-          <w:bCs/>
-          <w:lang w:val="en-US"/>
-        </w:rPr>
-      </w:pPr>
-      <w:r>
-        <w:rPr>
-          <w:rFonts w:ascii="Arial" w:eastAsia="Arial" w:hAnsi="Arial" w:cs="Arial"/>
-          <w:b/>
-          <w:bCs/>
-          <w:lang w:val="en-US"/>
-        </w:rPr>
-        <w:t>Keywords:</w:t>
-      </w:r>
-      <w:r>
-        <w:rPr>
-          <w:rFonts w:ascii="Arial" w:eastAsia="Arial" w:hAnsi="Arial" w:cs="Arial"/>
-          <w:b/>
-          <w:bCs/>
-          <w:lang w:val="en-US"/>
-        </w:rPr>
-        <w:t xml:space="preserve"> </w:t>
-      </w:r>
-      <w:r>
-        <w:rPr>
-          <w:rFonts w:ascii="Arial" w:eastAsia="Arial" w:hAnsi="Arial" w:cs="Arial"/>
-          <w:lang w:val="en-US"/>
-        </w:rPr>
-        <w:t>Agronomy, Development, Dashboard, Optimization</w:t>
-      </w:r>
-    </w:p>
-    <w:p>
-      <w:pPr>
-        <w:spacing w:after="0" w:line="360" w:lineRule="auto"/>
-        <w:ind w:firstLine="283"/>
-        <w:contextualSpacing/>
-        <w:jc w:val="both"/>
-        <w:rPr>
-          <w:rFonts w:ascii="Arial" w:eastAsia="Arial" w:hAnsi="Arial" w:cs="Arial"/>
-          <w:lang w:val="en-US"/>
-        </w:rPr>
-      </w:pPr>
-    </w:p>
-    <w:p>
-      <w:pPr>
-        <w:spacing w:after="0" w:line="360" w:lineRule="auto"/>
-        <w:ind w:firstLine="283"/>
-        <w:contextualSpacing/>
-        <w:jc w:val="both"/>
-        <w:rPr>
-          <w:rFonts w:ascii="Arial" w:eastAsia="Arial" w:hAnsi="Arial" w:cs="Arial"/>
-          <w:lang w:val="en-US"/>
-        </w:rPr>
-      </w:pPr>
-    </w:p>
-    <w:p>
-      <w:pPr>
-        <w:spacing w:after="0" w:line="360" w:lineRule="auto"/>
-        <w:ind w:firstLine="283"/>
-        <w:contextualSpacing/>
-        <w:jc w:val="both"/>
-        <w:rPr>
-          <w:rFonts w:ascii="Arial" w:eastAsia="Arial" w:hAnsi="Arial" w:cs="Arial"/>
-          <w:lang w:val="en-US"/>
-        </w:rPr>
-      </w:pPr>
-    </w:p>
-    <w:p>
-      <w:pPr>
-        <w:spacing w:after="0" w:line="360" w:lineRule="auto"/>
-        <w:ind w:firstLine="283"/>
-        <w:contextualSpacing/>
-        <w:jc w:val="both"/>
-        <w:rPr>
-          <w:rFonts w:ascii="Arial" w:eastAsia="Arial" w:hAnsi="Arial" w:cs="Arial"/>
-          <w:lang w:val="en-US"/>
-        </w:rPr>
-      </w:pPr>
-    </w:p>
-    <w:p>
-      <w:pPr>
-        <w:spacing w:after="0" w:line="360" w:lineRule="auto"/>
-        <w:ind w:firstLine="283"/>
-        <w:contextualSpacing/>
-        <w:jc w:val="both"/>
-        <w:rPr>
-          <w:rFonts w:ascii="Arial" w:eastAsia="Arial" w:hAnsi="Arial" w:cs="Arial"/>
-          <w:lang w:val="en-US"/>
-        </w:rPr>
-      </w:pPr>
-    </w:p>
-    <w:p>
-      <w:pPr>
-        <w:spacing w:after="0" w:line="360" w:lineRule="auto"/>
-        <w:ind w:firstLine="283"/>
-        <w:contextualSpacing/>
-        <w:jc w:val="both"/>
-        <w:rPr>
-          <w:rFonts w:ascii="Arial" w:eastAsia="Arial" w:hAnsi="Arial" w:cs="Arial"/>
-          <w:lang w:val="en-US"/>
-        </w:rPr>
-      </w:pPr>
-    </w:p>
-    <w:p>
-      <w:pPr>
-        <w:spacing w:after="0" w:line="360" w:lineRule="auto"/>
-        <w:ind w:firstLine="283"/>
-        <w:contextualSpacing/>
-        <w:jc w:val="both"/>
-        <w:rPr>
-          <w:rFonts w:ascii="Arial" w:eastAsia="Arial" w:hAnsi="Arial" w:cs="Arial"/>
-          <w:lang w:val="en-US"/>
-        </w:rPr>
-      </w:pPr>
-    </w:p>
-    <w:p>
-      <w:pPr>
-        <w:spacing w:after="0" w:line="360" w:lineRule="auto"/>
-        <w:ind w:firstLine="283"/>
-        <w:contextualSpacing/>
-        <w:jc w:val="both"/>
-        <w:rPr>
-          <w:rFonts w:ascii="Arial" w:eastAsia="Arial" w:hAnsi="Arial" w:cs="Arial"/>
-          <w:lang w:val="en-US"/>
-        </w:rPr>
-      </w:pPr>
-    </w:p>
-    <w:p>
-      <w:pPr>
-        <w:spacing w:after="0" w:line="360" w:lineRule="auto"/>
-        <w:ind w:firstLine="283"/>
-        <w:contextualSpacing/>
-        <w:jc w:val="both"/>
-        <w:rPr>
-          <w:rFonts w:ascii="Arial" w:eastAsia="Arial" w:hAnsi="Arial" w:cs="Arial"/>
-          <w:lang w:val="en-US"/>
-        </w:rPr>
-      </w:pPr>
-    </w:p>
-    <w:p>
-      <w:pPr>
-        <w:spacing w:after="0" w:line="360" w:lineRule="auto"/>
-        <w:ind w:firstLine="283"/>
-        <w:contextualSpacing/>
-        <w:jc w:val="both"/>
-        <w:rPr>
-          <w:rFonts w:ascii="Arial" w:eastAsia="Arial" w:hAnsi="Arial" w:cs="Arial"/>
-          <w:lang w:val="en-US"/>
-        </w:rPr>
-      </w:pPr>
-    </w:p>
-    <w:p>
-      <w:pPr>
-        <w:spacing w:after="0" w:line="360" w:lineRule="auto"/>
-        <w:ind w:firstLine="283"/>
-        <w:contextualSpacing/>
-        <w:jc w:val="both"/>
-        <w:rPr>
-          <w:rFonts w:ascii="Arial" w:eastAsia="Arial" w:hAnsi="Arial" w:cs="Arial"/>
-          <w:lang w:val="en-US"/>
-        </w:rPr>
-      </w:pPr>
-    </w:p>
-    <w:p>
-      <w:pPr>
-        <w:spacing w:after="0" w:line="360" w:lineRule="auto"/>
-        <w:ind w:firstLine="283"/>
-        <w:contextualSpacing/>
-        <w:jc w:val="both"/>
-        <w:rPr>
-          <w:rFonts w:ascii="Arial" w:eastAsia="Arial" w:hAnsi="Arial" w:cs="Arial"/>
-          <w:lang w:val="en-US"/>
-        </w:rPr>
-      </w:pPr>
-    </w:p>
-    <w:p>
-      <w:pPr>
-        <w:spacing w:after="0" w:line="360" w:lineRule="auto"/>
-        <w:ind w:firstLine="283"/>
-        <w:contextualSpacing/>
-        <w:jc w:val="both"/>
-        <w:rPr>
-          <w:rFonts w:ascii="Arial" w:eastAsia="Arial" w:hAnsi="Arial" w:cs="Arial"/>
-          <w:lang w:val="en-US"/>
-        </w:rPr>
-      </w:pPr>
-    </w:p>
-    <w:p>
-      <w:pPr>
-        <w:spacing w:after="0" w:line="360" w:lineRule="auto"/>
-        <w:ind w:firstLine="283"/>
-        <w:contextualSpacing/>
-        <w:jc w:val="both"/>
-        <w:rPr>
-          <w:rFonts w:ascii="Arial" w:eastAsia="Arial" w:hAnsi="Arial" w:cs="Arial"/>
-          <w:lang w:val="en-US"/>
-        </w:rPr>
-      </w:pPr>
-    </w:p>
-    <w:p>
-      <w:pPr>
-        <w:spacing w:after="0" w:line="360" w:lineRule="auto"/>
-        <w:ind w:firstLine="283"/>
-        <w:contextualSpacing/>
-        <w:jc w:val="both"/>
-        <w:rPr>
-          <w:rFonts w:ascii="Arial" w:eastAsia="Arial" w:hAnsi="Arial" w:cs="Arial"/>
-          <w:lang w:val="en-US"/>
-        </w:rPr>
-      </w:pPr>
-    </w:p>
-    <w:p>
-      <w:pPr>
-        <w:pStyle w:val="Ttulo"/>
-        <w:ind w:left="283"/>
-        <w:jc w:val="center"/>
-        <w:rPr>
-          <w:rFonts w:ascii="Arial" w:eastAsia="Arial" w:hAnsi="Arial" w:cs="Arial"/>
-          <w:b/>
-          <w:bCs/>
-          <w:sz w:val="28"/>
-          <w:szCs w:val="28"/>
-          <w:lang w:val="en-US"/>
-        </w:rPr>
-      </w:pPr>
-      <w:r>
-        <w:rPr>
-          <w:rFonts w:ascii="Arial" w:eastAsia="Arial" w:hAnsi="Arial" w:cs="Arial"/>
-          <w:b/>
-          <w:bCs/>
-          <w:sz w:val="28"/>
-          <w:szCs w:val="28"/>
-          <w:lang w:val="en-US"/>
-        </w:rPr>
-        <w:lastRenderedPageBreak/>
-        <w:t>SUMÁRIO</w:t>
-      </w:r>
-    </w:p>
-    <w:p>
-      <w:pPr>
-        <w:spacing w:after="0" w:line="360" w:lineRule="auto"/>
-        <w:ind w:firstLine="283"/>
-        <w:contextualSpacing/>
-        <w:jc w:val="center"/>
-        <w:rPr>
-          <w:rFonts w:ascii="Arial" w:eastAsia="Arial" w:hAnsi="Arial" w:cs="Arial"/>
-          <w:b/>
-          <w:bCs/>
-          <w:lang w:val="en-US"/>
-        </w:rPr>
-      </w:pPr>
-    </w:p>
-    <w:p>
-      <w:pPr>
-        <w:pStyle w:val="PargrafodaLista"/>
-        <w:rPr>
-          <w:lang w:val="en-US"/>
-        </w:rPr>
-      </w:pPr>
-    </w:p>
-    <w:p>
-      <w:pPr>
-        <w:pStyle w:val="PargrafodaLista"/>
-        <w:rPr>
-          <w:lang w:val="en-US"/>
-        </w:rPr>
-      </w:pPr>
-    </w:p>
-    <w:p>
-      <w:pPr>
-        <w:pStyle w:val="PargrafodaLista"/>
-        <w:rPr>
-          <w:lang w:val="en-US"/>
-        </w:rPr>
-      </w:pPr>
-    </w:p>
-    <w:p>
-      <w:pPr>
-        <w:pStyle w:val="PargrafodaLista"/>
-        <w:rPr>
-          <w:lang w:val="en-US"/>
-        </w:rPr>
-      </w:pPr>
-    </w:p>
-    <w:p>
-      <w:pPr>
-        <w:pStyle w:val="PargrafodaLista"/>
-        <w:rPr>
-          <w:lang w:val="en-US"/>
-        </w:rPr>
-      </w:pPr>
-    </w:p>
-    <w:p>
-      <w:pPr>
-        <w:pStyle w:val="PargrafodaLista"/>
-        <w:rPr>
-          <w:lang w:val="en-US"/>
-        </w:rPr>
-      </w:pPr>
-    </w:p>
-    <w:p>
-      <w:pPr>
-        <w:pStyle w:val="PargrafodaLista"/>
-        <w:rPr>
-          <w:lang w:val="en-US"/>
-        </w:rPr>
-      </w:pPr>
-    </w:p>
-    <w:p>
-      <w:pPr>
-        <w:pStyle w:val="PargrafodaLista"/>
-        <w:rPr>
-          <w:lang w:val="en-US"/>
-        </w:rPr>
-      </w:pPr>
-    </w:p>
-    <w:p>
-      <w:pPr>
-        <w:pStyle w:val="PargrafodaLista"/>
-        <w:rPr>
-          <w:lang w:val="en-US"/>
-        </w:rPr>
-      </w:pPr>
-    </w:p>
-    <w:p>
-      <w:pPr>
-        <w:pStyle w:val="PargrafodaLista"/>
-        <w:rPr>
-          <w:lang w:val="en-US"/>
-        </w:rPr>
-      </w:pPr>
-    </w:p>
-    <w:p>
-      <w:pPr>
-        <w:pStyle w:val="PargrafodaLista"/>
-        <w:rPr>
-          <w:lang w:val="en-US"/>
-        </w:rPr>
-      </w:pPr>
-    </w:p>
-    <w:p>
-      <w:pPr>
-        <w:pStyle w:val="PargrafodaLista"/>
-        <w:rPr>
-          <w:lang w:val="en-US"/>
-        </w:rPr>
-      </w:pPr>
-    </w:p>
-    <w:p>
-      <w:pPr>
-        <w:pStyle w:val="PargrafodaLista"/>
-        <w:rPr>
-          <w:lang w:val="en-US"/>
-        </w:rPr>
-      </w:pPr>
-    </w:p>
-    <w:p>
-      <w:pPr>
-        <w:pStyle w:val="PargrafodaLista"/>
-        <w:rPr>
-          <w:lang w:val="en-US"/>
-        </w:rPr>
-      </w:pPr>
-    </w:p>
-    <w:p>
-      <w:pPr>
-        <w:pStyle w:val="PargrafodaLista"/>
-        <w:rPr>
-          <w:lang w:val="en-US"/>
-        </w:rPr>
-      </w:pPr>
-    </w:p>
-    <w:p>
-      <w:pPr>
-        <w:pStyle w:val="PargrafodaLista"/>
-        <w:rPr>
-          <w:lang w:val="en-US"/>
-        </w:rPr>
-      </w:pPr>
-    </w:p>
-    <w:p>
-      <w:pPr>
-        <w:pStyle w:val="PargrafodaLista"/>
-        <w:rPr>
-          <w:lang w:val="en-US"/>
-        </w:rPr>
-      </w:pPr>
-    </w:p>
-    <w:p>
-      <w:pPr>
-        <w:pStyle w:val="PargrafodaLista"/>
-        <w:rPr>
-          <w:lang w:val="en-US"/>
-        </w:rPr>
-      </w:pPr>
-    </w:p>
-    <w:p>
-      <w:pPr>
-        <w:pStyle w:val="PargrafodaLista"/>
-        <w:rPr>
-          <w:lang w:val="en-US"/>
-        </w:rPr>
-      </w:pPr>
-    </w:p>
-    <w:p>
-      <w:pPr>
-        <w:pStyle w:val="PargrafodaLista"/>
-        <w:rPr>
-          <w:lang w:val="en-US"/>
-        </w:rPr>
-      </w:pPr>
-    </w:p>
-    <w:p>
-      <w:pPr>
-        <w:pStyle w:val="PargrafodaLista"/>
-        <w:rPr>
-          <w:lang w:val="en-US"/>
-        </w:rPr>
-      </w:pPr>
-    </w:p>
-    <w:p>
-      <w:pPr>
-        <w:pStyle w:val="PargrafodaLista"/>
-        <w:rPr>
-          <w:lang w:val="en-US"/>
-        </w:rPr>
-      </w:pPr>
-    </w:p>
-    <w:p>
-      <w:pPr>
-        <w:pStyle w:val="PargrafodaLista"/>
-        <w:rPr>
-          <w:lang w:val="en-US"/>
-        </w:rPr>
-      </w:pPr>
-    </w:p>
-    <w:p>
-      <w:pPr>
-        <w:pStyle w:val="PargrafodaLista"/>
-        <w:rPr>
-          <w:lang w:val="en-US"/>
-        </w:rPr>
-      </w:pPr>
-    </w:p>
-    <w:p>
-      <w:pPr>
-        <w:pStyle w:val="PargrafodaLista"/>
-        <w:rPr>
-          <w:lang w:val="en-US"/>
-        </w:rPr>
-      </w:pPr>
-    </w:p>
-    <w:p>
-      <w:pPr>
-        <w:pStyle w:val="PargrafodaLista"/>
-        <w:rPr>
-          <w:lang w:val="en-US"/>
-        </w:rPr>
-      </w:pPr>
-    </w:p>
-    <w:p>
-      <w:pPr>
-        <w:pStyle w:val="PargrafodaLista"/>
-        <w:rPr>
-          <w:lang w:val="en-US"/>
-        </w:rPr>
-      </w:pPr>
-    </w:p>
-    <w:p>
-      <w:pPr>
-        <w:pStyle w:val="PargrafodaLista"/>
-        <w:rPr>
-          <w:lang w:val="en-US"/>
-        </w:rPr>
-      </w:pPr>
-    </w:p>
-    <w:p>
-      <w:pPr>
-        <w:pStyle w:val="PargrafodaLista"/>
-        <w:rPr>
-          <w:lang w:val="en-US"/>
-        </w:rPr>
-      </w:pPr>
-    </w:p>
-    <w:p>
-      <w:pPr>
-        <w:pStyle w:val="PargrafodaLista"/>
-        <w:rPr>
-          <w:lang w:val="en-US"/>
-        </w:rPr>
-      </w:pPr>
-    </w:p>
-    <w:p>
-      <w:pPr>
-        <w:pStyle w:val="PargrafodaLista"/>
-        <w:rPr>
-          <w:lang w:val="en-US"/>
-        </w:rPr>
-      </w:pPr>
-    </w:p>
-    <w:p>
-      <w:pPr>
-        <w:pStyle w:val="PargrafodaLista"/>
-        <w:rPr>
-          <w:lang w:val="en-US"/>
-        </w:rPr>
-      </w:pPr>
-    </w:p>
-    <w:p>
-      <w:pPr>
-        <w:pStyle w:val="PargrafodaLista"/>
-        <w:rPr>
-          <w:lang w:val="en-US"/>
-        </w:rPr>
-      </w:pPr>
-    </w:p>
-    <w:p>
-      <w:pPr>
-        <w:pStyle w:val="PargrafodaLista"/>
-        <w:rPr>
-          <w:lang w:val="en-US"/>
-        </w:rPr>
-      </w:pPr>
-    </w:p>
-    <w:p>
-      <w:pPr>
-        <w:pStyle w:val="PargrafodaLista"/>
-        <w:rPr>
-          <w:lang w:val="en-US"/>
-        </w:rPr>
-      </w:pPr>
-    </w:p>
-    <w:p>
-      <w:pPr>
-        <w:pStyle w:val="PargrafodaLista"/>
-        <w:rPr>
-          <w:lang w:val="en-US"/>
-        </w:rPr>
-      </w:pPr>
-    </w:p>
-    <w:p>
-      <w:pPr>
-        <w:pStyle w:val="PargrafodaLista"/>
-        <w:rPr>
-          <w:lang w:val="en-US"/>
-        </w:rPr>
-      </w:pPr>
-    </w:p>
-    <w:p>
-      <w:pPr>
-        <w:pStyle w:val="PargrafodaLista"/>
-        <w:rPr>
-          <w:lang w:val="en-US"/>
-        </w:rPr>
-      </w:pPr>
-    </w:p>
-    <w:p>
-      <w:pPr>
-        <w:rPr>
-          <w:lang w:val="en-US"/>
-        </w:rPr>
-      </w:pPr>
-    </w:p>
-    <w:p>
-      <w:pPr>
-        <w:pStyle w:val="Ttulo"/>
-        <w:rPr>
-          <w:rFonts w:ascii="Arial" w:eastAsia="Arial" w:hAnsi="Arial" w:cs="Arial"/>
-          <w:b/>
-          <w:bCs/>
-          <w:sz w:val="28"/>
-          <w:szCs w:val="28"/>
-          <w:lang w:val="en-US"/>
-        </w:rPr>
-      </w:pPr>
-      <w:r>
-        <w:rPr>
-          <w:rFonts w:ascii="Arial" w:eastAsia="Arial" w:hAnsi="Arial" w:cs="Arial"/>
-          <w:b/>
-          <w:bCs/>
-          <w:sz w:val="28"/>
-          <w:szCs w:val="28"/>
-          <w:lang w:val="en-US"/>
-        </w:rPr>
-        <w:t xml:space="preserve">1 </w:t>
-      </w:r>
-      <w:r>
-        <w:rPr>
-          <w:rFonts w:ascii="Arial" w:eastAsia="Arial" w:hAnsi="Arial" w:cs="Arial"/>
-          <w:b/>
-          <w:bCs/>
-          <w:sz w:val="28"/>
-          <w:szCs w:val="28"/>
-          <w:lang w:val="en-US"/>
-        </w:rPr>
-        <w:t>INTRODUÇÃO</w:t>
-      </w:r>
-    </w:p>
-    <w:p>
-      <w:pPr>
-        <w:shd w:val="clear" w:color="auto" w:fill="FFFFFF" w:themeFill="background1"/>
-        <w:spacing w:before="24" w:after="0" w:line="360" w:lineRule="auto"/>
-        <w:ind w:firstLine="283"/>
-        <w:contextualSpacing/>
-        <w:jc w:val="both"/>
-        <w:rPr>
-          <w:rFonts w:ascii="Arial" w:eastAsia="Arial" w:hAnsi="Arial" w:cs="Arial"/>
           <w:color w:val="222222"/>
           <w:lang w:val="en-US"/>
         </w:rPr>
-      </w:pPr>
-      <w:r>
-        <w:rPr>
-          <w:rFonts w:ascii="Arial" w:eastAsia="Arial" w:hAnsi="Arial" w:cs="Arial"/>
-          <w:color w:val="222222"/>
-          <w:lang w:val="en-US"/>
-        </w:rPr>
-        <w:t xml:space="preserve">    </w:t>
-      </w:r>
-      <w:r>
-        <w:rPr>
-          <w:rFonts w:ascii="Arial" w:eastAsia="Arial" w:hAnsi="Arial" w:cs="Arial"/>
-          <w:color w:val="222222"/>
-          <w:lang w:val="en-US"/>
-        </w:rPr>
-        <w:t>Diante da crescente demanda por decisões rápidas e fundamentadas em informações confiáveis, o uso de ferramentas de visualização de dados torna-se essencial para uma gestão comercial eficiente. Nesse cenário, este projeto propõe o desenvolvimento de um dashboard voltado ao setor de agronomia, estruturado como um painel centralizado capaz de converter dados operacionais em indicadores visuais claros, precisos e de fácil interpretação.</w:t>
+        <w:t xml:space="preserve"> voltado ao setor de agronomia, estruturado como um painel centralizado capaz de converter dados operacionais em indicadores visuais claros, precisos e de fácil interpretação.</w:t>
       </w:r>
     </w:p>
     <w:p>

</xml_diff>

<commit_message>
Doc: Desenvolvimento na documentação do projeto.
</commit_message>
<xml_diff>
--- a/Documentação.docx
+++ b/Documentação.docx
@@ -31,7 +31,7 @@
                     <pic:cNvPicPr/>
                   </pic:nvPicPr>
                   <pic:blipFill>
-                    <a:blip r:embed="rId7">
+                    <a:blip r:embed="rId8">
                       <a:extLst>
                         <a:ext uri="{28A0092B-C50C-407E-A947-70E740481C1C}">
                           <a14:useLocalDpi xmlns:a14="http://schemas.microsoft.com/office/drawing/2010/main"/>
@@ -1588,6 +1588,633 @@
         <w:t>SUMÁRIO</w:t>
       </w:r>
     </w:p>
+    <w:sdt>
+      <w:sdtPr>
+        <w:id w:val="-1182196434"/>
+        <w:docPartObj>
+          <w:docPartGallery w:val="Table of Contents"/>
+          <w:docPartUnique/>
+        </w:docPartObj>
+      </w:sdtPr>
+      <w:sdtEndPr>
+        <w:rPr>
+          <w:rFonts w:asciiTheme="minorHAnsi" w:eastAsiaTheme="minorEastAsia" w:hAnsiTheme="minorHAnsi" w:cs="Times New Roman"/>
+          <w:color w:val="auto"/>
+          <w:sz w:val="22"/>
+          <w:szCs w:val="22"/>
+        </w:rPr>
+      </w:sdtEndPr>
+      <w:sdtContent>
+        <w:p>
+          <w:pPr>
+            <w:pStyle w:val="CabealhodoSumrio"/>
+            <w:rPr>
+              <w:rFonts w:ascii="Arial" w:hAnsi="Arial" w:cs="Arial"/>
+              <w:sz w:val="24"/>
+              <w:szCs w:val="24"/>
+            </w:rPr>
+          </w:pPr>
+        </w:p>
+        <w:p>
+          <w:pPr>
+            <w:pStyle w:val="Sumrio1"/>
+            <w:rPr>
+              <w:rFonts w:ascii="Arial" w:hAnsi="Arial" w:cs="Arial"/>
+              <w:b/>
+              <w:color w:val="000000"/>
+            </w:rPr>
+          </w:pPr>
+          <w:r>
+            <w:rPr>
+              <w:rFonts w:ascii="Arial" w:hAnsi="Arial" w:cs="Arial"/>
+              <w:b/>
+              <w:color w:val="000000"/>
+            </w:rPr>
+            <w:t>1. INTRODUÇÃO...................................................................................................................9</w:t>
+          </w:r>
+        </w:p>
+        <w:p>
+          <w:pPr>
+            <w:pStyle w:val="Sumrio1"/>
+            <w:rPr>
+              <w:rFonts w:ascii="Arial" w:hAnsi="Arial" w:cs="Arial"/>
+              <w:b/>
+              <w:color w:val="000000"/>
+            </w:rPr>
+          </w:pPr>
+          <w:r>
+            <w:rPr>
+              <w:rFonts w:ascii="Arial" w:hAnsi="Arial" w:cs="Arial"/>
+              <w:b/>
+              <w:color w:val="000000"/>
+            </w:rPr>
+            <w:t>2. DESENVOLVIMENTO.....................................................................................................10</w:t>
+          </w:r>
+        </w:p>
+        <w:p>
+          <w:pPr>
+            <w:pStyle w:val="Sumrio1"/>
+            <w:rPr>
+              <w:rFonts w:ascii="Arial" w:hAnsi="Arial" w:cs="Arial"/>
+              <w:b/>
+              <w:color w:val="000000"/>
+            </w:rPr>
+          </w:pPr>
+          <w:r>
+            <w:rPr>
+              <w:rFonts w:ascii="Arial" w:hAnsi="Arial" w:cs="Arial"/>
+              <w:b/>
+              <w:color w:val="000000"/>
+            </w:rPr>
+            <w:t>2.1 Objetivo geral ..........................................................................................................</w:t>
+          </w:r>
+          <w:r>
+            <w:rPr>
+              <w:rFonts w:ascii="Arial" w:hAnsi="Arial" w:cs="Arial"/>
+              <w:b/>
+              <w:color w:val="000000"/>
+            </w:rPr>
+            <w:t>....</w:t>
+          </w:r>
+          <w:r>
+            <w:rPr>
+              <w:rFonts w:ascii="Arial" w:hAnsi="Arial" w:cs="Arial"/>
+              <w:b/>
+              <w:color w:val="000000"/>
+            </w:rPr>
+            <w:t>10</w:t>
+          </w:r>
+        </w:p>
+        <w:p>
+          <w:pPr>
+            <w:pStyle w:val="Sumrio1"/>
+            <w:rPr>
+              <w:rFonts w:ascii="Arial" w:hAnsi="Arial" w:cs="Arial"/>
+              <w:b/>
+              <w:color w:val="000000"/>
+            </w:rPr>
+          </w:pPr>
+          <w:r>
+            <w:rPr>
+              <w:rFonts w:ascii="Arial" w:hAnsi="Arial" w:cs="Arial"/>
+              <w:b/>
+              <w:color w:val="000000"/>
+            </w:rPr>
+            <w:t>2.2 Objetivos específicos............................................................................................</w:t>
+          </w:r>
+          <w:r>
+            <w:rPr>
+              <w:rFonts w:ascii="Arial" w:hAnsi="Arial" w:cs="Arial"/>
+              <w:b/>
+              <w:color w:val="000000"/>
+            </w:rPr>
+            <w:t>......</w:t>
+          </w:r>
+          <w:r>
+            <w:rPr>
+              <w:rFonts w:ascii="Arial" w:hAnsi="Arial" w:cs="Arial"/>
+              <w:b/>
+              <w:color w:val="000000"/>
+            </w:rPr>
+            <w:t>10</w:t>
+          </w:r>
+        </w:p>
+        <w:p>
+          <w:pPr>
+            <w:pStyle w:val="Sumrio1"/>
+            <w:rPr>
+              <w:rFonts w:ascii="Arial" w:hAnsi="Arial" w:cs="Arial"/>
+              <w:b/>
+              <w:color w:val="000000"/>
+            </w:rPr>
+          </w:pPr>
+          <w:r>
+            <w:rPr>
+              <w:rFonts w:ascii="Arial" w:hAnsi="Arial" w:cs="Arial"/>
+              <w:b/>
+              <w:color w:val="000000"/>
+            </w:rPr>
+            <w:t>3. REVISÃO BIBLIOGRÁFICA...............................................</w:t>
+          </w:r>
+          <w:r>
+            <w:rPr>
+              <w:rFonts w:ascii="Arial" w:hAnsi="Arial" w:cs="Arial"/>
+              <w:b/>
+              <w:color w:val="000000"/>
+            </w:rPr>
+            <w:t>............................................11</w:t>
+          </w:r>
+        </w:p>
+        <w:p>
+          <w:pPr>
+            <w:pStyle w:val="Sumrio1"/>
+            <w:rPr>
+              <w:rFonts w:ascii="Arial" w:hAnsi="Arial" w:cs="Arial"/>
+              <w:b/>
+              <w:color w:val="000000"/>
+            </w:rPr>
+          </w:pPr>
+          <w:r>
+            <w:rPr>
+              <w:rFonts w:ascii="Arial" w:hAnsi="Arial" w:cs="Arial"/>
+              <w:b/>
+              <w:color w:val="000000"/>
+            </w:rPr>
+            <w:t>4. METODOLOGIA............................................................................................................. 11</w:t>
+          </w:r>
+        </w:p>
+        <w:p>
+          <w:pPr>
+            <w:pStyle w:val="Sumrio1"/>
+            <w:rPr>
+              <w:rFonts w:ascii="Arial" w:hAnsi="Arial" w:cs="Arial"/>
+              <w:b/>
+              <w:color w:val="000000"/>
+            </w:rPr>
+          </w:pPr>
+          <w:r>
+            <w:rPr>
+              <w:rFonts w:ascii="Arial" w:hAnsi="Arial" w:cs="Arial"/>
+              <w:b/>
+              <w:color w:val="000000"/>
+            </w:rPr>
+            <w:t>5. MÉTODOS.......................................................................................................................11</w:t>
+          </w:r>
+        </w:p>
+        <w:p>
+          <w:pPr>
+            <w:pStyle w:val="Sumrio1"/>
+            <w:rPr>
+              <w:rFonts w:ascii="Arial" w:hAnsi="Arial" w:cs="Arial"/>
+              <w:b/>
+              <w:color w:val="000000"/>
+            </w:rPr>
+          </w:pPr>
+          <w:r>
+            <w:rPr>
+              <w:rFonts w:ascii="Arial" w:hAnsi="Arial" w:cs="Arial"/>
+              <w:b/>
+              <w:color w:val="000000"/>
+            </w:rPr>
+            <w:t>5.1 VsCode......................................................................................................................</w:t>
+          </w:r>
+          <w:r>
+            <w:rPr>
+              <w:rFonts w:ascii="Arial" w:hAnsi="Arial" w:cs="Arial"/>
+              <w:b/>
+              <w:color w:val="000000"/>
+            </w:rPr>
+            <w:t>....</w:t>
+          </w:r>
+          <w:r>
+            <w:rPr>
+              <w:rFonts w:ascii="Arial" w:hAnsi="Arial" w:cs="Arial"/>
+              <w:b/>
+              <w:color w:val="000000"/>
+            </w:rPr>
+            <w:t>11</w:t>
+          </w:r>
+        </w:p>
+        <w:p>
+          <w:pPr>
+            <w:pStyle w:val="Sumrio1"/>
+            <w:rPr>
+              <w:rFonts w:ascii="Arial" w:hAnsi="Arial" w:cs="Arial"/>
+              <w:b/>
+              <w:color w:val="000000"/>
+            </w:rPr>
+          </w:pPr>
+          <w:r>
+            <w:rPr>
+              <w:rFonts w:ascii="Arial" w:hAnsi="Arial" w:cs="Arial"/>
+              <w:b/>
+              <w:color w:val="000000"/>
+            </w:rPr>
+            <w:t>5.2 API..............................................................................................................................</w:t>
+          </w:r>
+          <w:r>
+            <w:rPr>
+              <w:rFonts w:ascii="Arial" w:hAnsi="Arial" w:cs="Arial"/>
+              <w:b/>
+              <w:color w:val="000000"/>
+            </w:rPr>
+            <w:t>...</w:t>
+          </w:r>
+          <w:r>
+            <w:rPr>
+              <w:rFonts w:ascii="Arial" w:hAnsi="Arial" w:cs="Arial"/>
+              <w:b/>
+              <w:color w:val="000000"/>
+            </w:rPr>
+            <w:t>12</w:t>
+          </w:r>
+        </w:p>
+        <w:p>
+          <w:pPr>
+            <w:pStyle w:val="Sumrio1"/>
+            <w:rPr>
+              <w:rFonts w:ascii="Arial" w:hAnsi="Arial" w:cs="Arial"/>
+              <w:b/>
+              <w:color w:val="000000"/>
+            </w:rPr>
+          </w:pPr>
+          <w:r>
+            <w:rPr>
+              <w:rFonts w:ascii="Arial" w:hAnsi="Arial" w:cs="Arial"/>
+              <w:b/>
+              <w:color w:val="000000"/>
+            </w:rPr>
+            <w:t>6. FRAMEWORK.................................................................................................................13</w:t>
+          </w:r>
+        </w:p>
+        <w:p>
+          <w:pPr>
+            <w:pStyle w:val="Sumrio1"/>
+            <w:rPr>
+              <w:rFonts w:ascii="Arial" w:hAnsi="Arial" w:cs="Arial"/>
+              <w:b/>
+              <w:color w:val="000000"/>
+            </w:rPr>
+          </w:pPr>
+          <w:r>
+            <w:rPr>
+              <w:rFonts w:ascii="Arial" w:hAnsi="Arial" w:cs="Arial"/>
+              <w:b/>
+              <w:color w:val="000000"/>
+            </w:rPr>
+            <w:t>6.1 React Native.............................................................................................................</w:t>
+          </w:r>
+          <w:r>
+            <w:rPr>
+              <w:rFonts w:ascii="Arial" w:hAnsi="Arial" w:cs="Arial"/>
+              <w:b/>
+              <w:color w:val="000000"/>
+            </w:rPr>
+            <w:t>.....</w:t>
+          </w:r>
+          <w:r>
+            <w:rPr>
+              <w:rFonts w:ascii="Arial" w:hAnsi="Arial" w:cs="Arial"/>
+              <w:b/>
+              <w:color w:val="000000"/>
+            </w:rPr>
+            <w:t>14</w:t>
+          </w:r>
+        </w:p>
+        <w:p>
+          <w:pPr>
+            <w:pStyle w:val="Sumrio1"/>
+            <w:rPr>
+              <w:rFonts w:ascii="Arial" w:hAnsi="Arial" w:cs="Arial"/>
+              <w:b/>
+              <w:color w:val="000000"/>
+            </w:rPr>
+          </w:pPr>
+          <w:r>
+            <w:rPr>
+              <w:rFonts w:ascii="Arial" w:hAnsi="Arial" w:cs="Arial"/>
+              <w:b/>
+              <w:color w:val="000000"/>
+            </w:rPr>
+            <w:t>6.2 JavaScript.................................................................................................................</w:t>
+          </w:r>
+          <w:r>
+            <w:rPr>
+              <w:rFonts w:ascii="Arial" w:hAnsi="Arial" w:cs="Arial"/>
+              <w:b/>
+              <w:color w:val="000000"/>
+            </w:rPr>
+            <w:t>....</w:t>
+          </w:r>
+          <w:r>
+            <w:rPr>
+              <w:rFonts w:ascii="Arial" w:hAnsi="Arial" w:cs="Arial"/>
+              <w:b/>
+              <w:color w:val="000000"/>
+            </w:rPr>
+            <w:t>14</w:t>
+          </w:r>
+        </w:p>
+        <w:p>
+          <w:pPr>
+            <w:pStyle w:val="Sumrio1"/>
+            <w:rPr>
+              <w:rFonts w:ascii="Arial" w:hAnsi="Arial" w:cs="Arial"/>
+              <w:b/>
+              <w:color w:val="000000"/>
+            </w:rPr>
+          </w:pPr>
+          <w:r>
+            <w:rPr>
+              <w:rFonts w:ascii="Arial" w:hAnsi="Arial" w:cs="Arial"/>
+              <w:b/>
+              <w:color w:val="000000"/>
+            </w:rPr>
+            <w:t>6.3 NodeJS......................................................................................................................</w:t>
+          </w:r>
+          <w:r>
+            <w:rPr>
+              <w:rFonts w:ascii="Arial" w:hAnsi="Arial" w:cs="Arial"/>
+              <w:b/>
+              <w:color w:val="000000"/>
+            </w:rPr>
+            <w:t>....</w:t>
+          </w:r>
+          <w:r>
+            <w:rPr>
+              <w:rFonts w:ascii="Arial" w:hAnsi="Arial" w:cs="Arial"/>
+              <w:b/>
+              <w:color w:val="000000"/>
+            </w:rPr>
+            <w:t>15</w:t>
+          </w:r>
+        </w:p>
+        <w:p>
+          <w:pPr>
+            <w:pStyle w:val="Sumrio1"/>
+            <w:rPr>
+              <w:rFonts w:ascii="Arial" w:hAnsi="Arial" w:cs="Arial"/>
+              <w:b/>
+              <w:color w:val="000000"/>
+            </w:rPr>
+          </w:pPr>
+          <w:r>
+            <w:rPr>
+              <w:rFonts w:ascii="Arial" w:hAnsi="Arial" w:cs="Arial"/>
+              <w:b/>
+              <w:color w:val="000000"/>
+            </w:rPr>
+            <w:t>6.4 Scrum ........................................................................................................................</w:t>
+          </w:r>
+          <w:r>
+            <w:rPr>
+              <w:rFonts w:ascii="Arial" w:hAnsi="Arial" w:cs="Arial"/>
+              <w:b/>
+              <w:color w:val="000000"/>
+            </w:rPr>
+            <w:t>...</w:t>
+          </w:r>
+          <w:r>
+            <w:rPr>
+              <w:rFonts w:ascii="Arial" w:hAnsi="Arial" w:cs="Arial"/>
+              <w:b/>
+              <w:color w:val="000000"/>
+            </w:rPr>
+            <w:t>15</w:t>
+          </w:r>
+        </w:p>
+        <w:p>
+          <w:pPr>
+            <w:pStyle w:val="Sumrio1"/>
+            <w:rPr>
+              <w:rFonts w:ascii="Arial" w:hAnsi="Arial" w:cs="Arial"/>
+              <w:b/>
+              <w:color w:val="000000"/>
+            </w:rPr>
+          </w:pPr>
+          <w:r>
+            <w:rPr>
+              <w:rFonts w:ascii="Arial" w:hAnsi="Arial" w:cs="Arial"/>
+              <w:b/>
+              <w:color w:val="000000"/>
+            </w:rPr>
+            <w:t>6.5 Jest.............................................................................................................................</w:t>
+          </w:r>
+          <w:r>
+            <w:rPr>
+              <w:rFonts w:ascii="Arial" w:hAnsi="Arial" w:cs="Arial"/>
+              <w:b/>
+              <w:color w:val="000000"/>
+            </w:rPr>
+            <w:t>...</w:t>
+          </w:r>
+          <w:r>
+            <w:rPr>
+              <w:rFonts w:ascii="Arial" w:hAnsi="Arial" w:cs="Arial"/>
+              <w:b/>
+              <w:color w:val="000000"/>
+            </w:rPr>
+            <w:t>16</w:t>
+          </w:r>
+        </w:p>
+        <w:p>
+          <w:pPr>
+            <w:pStyle w:val="Sumrio1"/>
+            <w:rPr>
+              <w:rFonts w:ascii="Arial" w:hAnsi="Arial" w:cs="Arial"/>
+              <w:b/>
+              <w:color w:val="000000"/>
+            </w:rPr>
+          </w:pPr>
+          <w:r>
+            <w:rPr>
+              <w:rFonts w:ascii="Arial" w:hAnsi="Arial" w:cs="Arial"/>
+              <w:b/>
+              <w:color w:val="000000"/>
+            </w:rPr>
+            <w:t>7. Figma.............................................................................................................................</w:t>
+          </w:r>
+          <w:r>
+            <w:rPr>
+              <w:rFonts w:ascii="Arial" w:hAnsi="Arial" w:cs="Arial"/>
+              <w:b/>
+              <w:color w:val="000000"/>
+            </w:rPr>
+            <w:t>.</w:t>
+          </w:r>
+          <w:r>
+            <w:rPr>
+              <w:rFonts w:ascii="Arial" w:hAnsi="Arial" w:cs="Arial"/>
+              <w:b/>
+              <w:color w:val="000000"/>
+            </w:rPr>
+            <w:t>.16</w:t>
+          </w:r>
+        </w:p>
+        <w:p>
+          <w:pPr>
+            <w:pStyle w:val="Sumrio1"/>
+            <w:rPr>
+              <w:rFonts w:ascii="Arial" w:hAnsi="Arial" w:cs="Arial"/>
+              <w:b/>
+              <w:color w:val="000000"/>
+            </w:rPr>
+          </w:pPr>
+          <w:r>
+            <w:rPr>
+              <w:rFonts w:ascii="Arial" w:hAnsi="Arial" w:cs="Arial"/>
+              <w:b/>
+              <w:color w:val="000000"/>
+            </w:rPr>
+            <w:t>8. Trello...............................................................................................................................17</w:t>
+          </w:r>
+        </w:p>
+        <w:p>
+          <w:pPr>
+            <w:pStyle w:val="Sumrio1"/>
+            <w:rPr>
+              <w:rFonts w:ascii="Arial" w:hAnsi="Arial" w:cs="Arial"/>
+              <w:b/>
+              <w:color w:val="000000"/>
+            </w:rPr>
+          </w:pPr>
+          <w:r>
+            <w:rPr>
+              <w:rFonts w:ascii="Arial" w:hAnsi="Arial" w:cs="Arial"/>
+              <w:b/>
+              <w:color w:val="000000"/>
+            </w:rPr>
+            <w:t>9. GitHub e Git ...................................................................................................................18</w:t>
+          </w:r>
+        </w:p>
+        <w:p>
+          <w:pPr>
+            <w:pStyle w:val="Sumrio1"/>
+            <w:rPr>
+              <w:rFonts w:ascii="Arial" w:hAnsi="Arial" w:cs="Arial"/>
+              <w:b/>
+              <w:color w:val="000000"/>
+            </w:rPr>
+          </w:pPr>
+          <w:r>
+            <w:rPr>
+              <w:rFonts w:ascii="Arial" w:hAnsi="Arial" w:cs="Arial"/>
+              <w:b/>
+              <w:color w:val="000000"/>
+            </w:rPr>
+            <w:t>10. Package.json ...............................................................................................................19</w:t>
+          </w:r>
+        </w:p>
+        <w:p>
+          <w:pPr>
+            <w:pStyle w:val="Sumrio1"/>
+            <w:rPr>
+              <w:rFonts w:ascii="Arial" w:hAnsi="Arial" w:cs="Arial"/>
+              <w:b/>
+              <w:color w:val="000000"/>
+            </w:rPr>
+          </w:pPr>
+          <w:r>
+            <w:rPr>
+              <w:rFonts w:ascii="Arial" w:hAnsi="Arial" w:cs="Arial"/>
+              <w:b/>
+              <w:color w:val="000000"/>
+            </w:rPr>
+            <w:t>11. Banco de dados.......................................................................................................... 20</w:t>
+          </w:r>
+        </w:p>
+        <w:p>
+          <w:pPr>
+            <w:pStyle w:val="Sumrio1"/>
+            <w:rPr>
+              <w:rFonts w:ascii="Arial" w:hAnsi="Arial" w:cs="Arial"/>
+              <w:b/>
+              <w:color w:val="000000"/>
+            </w:rPr>
+          </w:pPr>
+          <w:r>
+            <w:rPr>
+              <w:rFonts w:ascii="Arial" w:hAnsi="Arial" w:cs="Arial"/>
+              <w:b/>
+              <w:color w:val="000000"/>
+            </w:rPr>
+            <w:t>12.RESULTADOS...............................................................................................................22</w:t>
+          </w:r>
+        </w:p>
+        <w:p>
+          <w:pPr>
+            <w:pStyle w:val="Sumrio1"/>
+            <w:rPr>
+              <w:rFonts w:ascii="Arial" w:hAnsi="Arial" w:cs="Arial"/>
+              <w:b/>
+              <w:color w:val="000000"/>
+            </w:rPr>
+          </w:pPr>
+          <w:r>
+            <w:rPr>
+              <w:rFonts w:ascii="Arial" w:hAnsi="Arial" w:cs="Arial"/>
+              <w:b/>
+              <w:color w:val="000000"/>
+            </w:rPr>
+            <w:t>13.CONSIDERAÇÕES FINAIS............................................................................................23</w:t>
+          </w:r>
+        </w:p>
+        <w:p>
+          <w:pPr>
+            <w:pStyle w:val="Sumrio1"/>
+            <w:rPr>
+              <w:rFonts w:ascii="Arial" w:hAnsi="Arial" w:cs="Arial"/>
+              <w:b/>
+              <w:color w:val="000000"/>
+            </w:rPr>
+          </w:pPr>
+          <w:r>
+            <w:rPr>
+              <w:rFonts w:ascii="Arial" w:hAnsi="Arial" w:cs="Arial"/>
+              <w:b/>
+              <w:color w:val="000000"/>
+            </w:rPr>
+            <w:t>14. REFERÊNCIAS .....................................................................................................</w:t>
+          </w:r>
+          <w:r>
+            <w:rPr>
+              <w:rFonts w:ascii="Arial" w:hAnsi="Arial" w:cs="Arial"/>
+              <w:b/>
+              <w:color w:val="000000"/>
+            </w:rPr>
+            <w:t>.......</w:t>
+          </w:r>
+          <w:r>
+            <w:rPr>
+              <w:rFonts w:ascii="Arial" w:hAnsi="Arial" w:cs="Arial"/>
+              <w:b/>
+              <w:color w:val="000000"/>
+            </w:rPr>
+            <w:t>24</w:t>
+          </w:r>
+        </w:p>
+      </w:sdtContent>
+    </w:sdt>
     <w:p>
       <w:pPr>
         <w:spacing w:after="0" w:line="360" w:lineRule="auto"/>
@@ -1652,6 +2279,11 @@
     </w:p>
     <w:p>
       <w:pPr>
+        <w:pStyle w:val="CabealhodoSumrio"/>
+      </w:pPr>
+    </w:p>
+    <w:p>
+      <w:pPr>
         <w:pStyle w:val="PargrafodaLista"/>
         <w:rPr>
           <w:lang w:val="en-US"/>
@@ -1668,272 +2300,39 @@
     </w:p>
     <w:p>
       <w:pPr>
-        <w:pStyle w:val="PargrafodaLista"/>
-        <w:rPr>
-          <w:lang w:val="en-US"/>
-        </w:rPr>
-      </w:pPr>
-    </w:p>
-    <w:p>
-      <w:pPr>
-        <w:pStyle w:val="PargrafodaLista"/>
-        <w:rPr>
-          <w:lang w:val="en-US"/>
-        </w:rPr>
-      </w:pPr>
-    </w:p>
-    <w:p>
-      <w:pPr>
-        <w:pStyle w:val="PargrafodaLista"/>
-        <w:rPr>
-          <w:lang w:val="en-US"/>
-        </w:rPr>
-      </w:pPr>
-    </w:p>
-    <w:p>
-      <w:pPr>
-        <w:pStyle w:val="PargrafodaLista"/>
-        <w:rPr>
-          <w:lang w:val="en-US"/>
-        </w:rPr>
-      </w:pPr>
-    </w:p>
-    <w:p>
-      <w:pPr>
-        <w:pStyle w:val="PargrafodaLista"/>
-        <w:rPr>
-          <w:lang w:val="en-US"/>
-        </w:rPr>
-      </w:pPr>
-    </w:p>
-    <w:p>
-      <w:pPr>
-        <w:pStyle w:val="PargrafodaLista"/>
-        <w:rPr>
-          <w:lang w:val="en-US"/>
-        </w:rPr>
-      </w:pPr>
-    </w:p>
-    <w:p>
-      <w:pPr>
-        <w:pStyle w:val="PargrafodaLista"/>
-        <w:rPr>
-          <w:lang w:val="en-US"/>
-        </w:rPr>
-      </w:pPr>
-    </w:p>
-    <w:p>
-      <w:pPr>
-        <w:pStyle w:val="PargrafodaLista"/>
-        <w:rPr>
-          <w:lang w:val="en-US"/>
-        </w:rPr>
-      </w:pPr>
-    </w:p>
-    <w:p>
-      <w:pPr>
-        <w:pStyle w:val="PargrafodaLista"/>
-        <w:rPr>
-          <w:lang w:val="en-US"/>
-        </w:rPr>
-      </w:pPr>
-    </w:p>
-    <w:p>
-      <w:pPr>
-        <w:pStyle w:val="PargrafodaLista"/>
-        <w:rPr>
-          <w:lang w:val="en-US"/>
-        </w:rPr>
-      </w:pPr>
-    </w:p>
-    <w:p>
-      <w:pPr>
-        <w:pStyle w:val="PargrafodaLista"/>
-        <w:rPr>
-          <w:lang w:val="en-US"/>
-        </w:rPr>
-      </w:pPr>
-    </w:p>
-    <w:p>
-      <w:pPr>
-        <w:pStyle w:val="PargrafodaLista"/>
-        <w:rPr>
-          <w:lang w:val="en-US"/>
-        </w:rPr>
-      </w:pPr>
-    </w:p>
-    <w:p>
-      <w:pPr>
-        <w:pStyle w:val="PargrafodaLista"/>
-        <w:rPr>
-          <w:lang w:val="en-US"/>
-        </w:rPr>
-      </w:pPr>
-    </w:p>
-    <w:p>
-      <w:pPr>
-        <w:pStyle w:val="PargrafodaLista"/>
-        <w:rPr>
-          <w:lang w:val="en-US"/>
-        </w:rPr>
-      </w:pPr>
-    </w:p>
-    <w:p>
-      <w:pPr>
-        <w:pStyle w:val="PargrafodaLista"/>
-        <w:rPr>
-          <w:lang w:val="en-US"/>
-        </w:rPr>
-      </w:pPr>
-    </w:p>
-    <w:p>
-      <w:pPr>
-        <w:pStyle w:val="PargrafodaLista"/>
-        <w:rPr>
-          <w:lang w:val="en-US"/>
-        </w:rPr>
-      </w:pPr>
-    </w:p>
-    <w:p>
-      <w:pPr>
-        <w:pStyle w:val="PargrafodaLista"/>
-        <w:rPr>
-          <w:lang w:val="en-US"/>
-        </w:rPr>
-      </w:pPr>
-    </w:p>
-    <w:p>
-      <w:pPr>
-        <w:pStyle w:val="PargrafodaLista"/>
-        <w:rPr>
-          <w:lang w:val="en-US"/>
-        </w:rPr>
-      </w:pPr>
-    </w:p>
-    <w:p>
-      <w:pPr>
-        <w:pStyle w:val="PargrafodaLista"/>
-        <w:rPr>
-          <w:lang w:val="en-US"/>
-        </w:rPr>
-      </w:pPr>
-    </w:p>
-    <w:p>
-      <w:pPr>
-        <w:pStyle w:val="PargrafodaLista"/>
-        <w:rPr>
-          <w:lang w:val="en-US"/>
-        </w:rPr>
-      </w:pPr>
-    </w:p>
-    <w:p>
-      <w:pPr>
-        <w:pStyle w:val="PargrafodaLista"/>
-        <w:rPr>
-          <w:lang w:val="en-US"/>
-        </w:rPr>
-      </w:pPr>
-    </w:p>
-    <w:p>
-      <w:pPr>
-        <w:pStyle w:val="PargrafodaLista"/>
-        <w:rPr>
-          <w:lang w:val="en-US"/>
-        </w:rPr>
-      </w:pPr>
-    </w:p>
-    <w:p>
-      <w:pPr>
-        <w:pStyle w:val="PargrafodaLista"/>
-        <w:rPr>
-          <w:lang w:val="en-US"/>
-        </w:rPr>
-      </w:pPr>
-    </w:p>
-    <w:p>
-      <w:pPr>
-        <w:pStyle w:val="PargrafodaLista"/>
-        <w:rPr>
-          <w:lang w:val="en-US"/>
-        </w:rPr>
-      </w:pPr>
-    </w:p>
-    <w:p>
-      <w:pPr>
-        <w:pStyle w:val="PargrafodaLista"/>
-        <w:rPr>
-          <w:lang w:val="en-US"/>
-        </w:rPr>
-      </w:pPr>
-    </w:p>
-    <w:p>
-      <w:pPr>
-        <w:pStyle w:val="PargrafodaLista"/>
-        <w:rPr>
-          <w:lang w:val="en-US"/>
-        </w:rPr>
-      </w:pPr>
-    </w:p>
-    <w:p>
-      <w:pPr>
-        <w:pStyle w:val="PargrafodaLista"/>
-        <w:rPr>
-          <w:lang w:val="en-US"/>
-        </w:rPr>
-      </w:pPr>
-    </w:p>
-    <w:p>
-      <w:pPr>
-        <w:pStyle w:val="PargrafodaLista"/>
-        <w:rPr>
-          <w:lang w:val="en-US"/>
-        </w:rPr>
-      </w:pPr>
-    </w:p>
-    <w:p>
-      <w:pPr>
-        <w:pStyle w:val="PargrafodaLista"/>
-        <w:rPr>
-          <w:lang w:val="en-US"/>
-        </w:rPr>
-      </w:pPr>
-    </w:p>
-    <w:p>
-      <w:pPr>
-        <w:pStyle w:val="PargrafodaLista"/>
-        <w:rPr>
-          <w:lang w:val="en-US"/>
-        </w:rPr>
-      </w:pPr>
-    </w:p>
-    <w:p>
-      <w:pPr>
-        <w:rPr>
-          <w:lang w:val="en-US"/>
-        </w:rPr>
-      </w:pPr>
-    </w:p>
-    <w:p>
-      <w:pPr>
         <w:pStyle w:val="Ttulo"/>
         <w:rPr>
-          <w:rFonts w:ascii="Arial" w:eastAsia="Arial" w:hAnsi="Arial" w:cs="Arial"/>
-          <w:b/>
-          <w:bCs/>
-          <w:sz w:val="28"/>
-          <w:szCs w:val="28"/>
-          <w:lang w:val="en-US"/>
-        </w:rPr>
-      </w:pPr>
-      <w:r>
-        <w:rPr>
-          <w:rFonts w:ascii="Arial" w:eastAsia="Arial" w:hAnsi="Arial" w:cs="Arial"/>
-          <w:b/>
-          <w:bCs/>
-          <w:sz w:val="28"/>
-          <w:szCs w:val="28"/>
-          <w:lang w:val="en-US"/>
-        </w:rPr>
+          <w:rFonts w:asciiTheme="minorHAnsi" w:eastAsiaTheme="minorHAnsi" w:hAnsiTheme="minorHAnsi" w:cstheme="minorBidi"/>
+          <w:spacing w:val="0"/>
+          <w:kern w:val="0"/>
+          <w:sz w:val="24"/>
+          <w:szCs w:val="24"/>
+          <w:lang w:val="en-US"/>
+        </w:rPr>
+      </w:pPr>
+    </w:p>
+    <w:p>
+      <w:pPr>
+        <w:pStyle w:val="Ttulo"/>
+        <w:rPr>
+          <w:rFonts w:ascii="Arial" w:eastAsia="Arial" w:hAnsi="Arial" w:cs="Arial"/>
+          <w:b/>
+          <w:bCs/>
+          <w:sz w:val="28"/>
+          <w:szCs w:val="28"/>
+          <w:lang w:val="en-US"/>
+        </w:rPr>
+      </w:pPr>
+      <w:r>
+        <w:rPr>
+          <w:rFonts w:ascii="Arial" w:eastAsia="Arial" w:hAnsi="Arial" w:cs="Arial"/>
+          <w:b/>
+          <w:bCs/>
+          <w:sz w:val="28"/>
+          <w:szCs w:val="28"/>
+          <w:lang w:val="en-US"/>
+        </w:rPr>
+        <w:lastRenderedPageBreak/>
         <w:t xml:space="preserve">1 </w:t>
       </w:r>
       <w:r>
@@ -1947,6 +2346,13 @@
         </w:rPr>
         <w:t>INTRODUÇÃO</w:t>
       </w:r>
+    </w:p>
+    <w:p>
+      <w:pPr>
+        <w:rPr>
+          <w:lang w:val="en-US"/>
+        </w:rPr>
+      </w:pPr>
     </w:p>
     <w:p>
       <w:pPr>
@@ -2015,233 +2421,678 @@
           <w:color w:val="222222"/>
           <w:lang w:val="en-US"/>
         </w:rPr>
-        <w:t xml:space="preserve">o </w:t>
+        <w:t>o atual</w:t>
+      </w:r>
+      <w:r>
+        <w:rPr>
+          <w:rFonts w:ascii="Arial" w:eastAsia="Arial" w:hAnsi="Arial" w:cs="Arial"/>
+          <w:color w:val="222222"/>
+          <w:lang w:val="en-US"/>
+        </w:rPr>
+        <w:t xml:space="preserve"> projeto propõe </w:t>
+      </w:r>
+      <w:r>
+        <w:rPr>
+          <w:rFonts w:ascii="Arial" w:eastAsia="Arial" w:hAnsi="Arial" w:cs="Arial"/>
+          <w:color w:val="222222"/>
+          <w:lang w:val="en-US"/>
+        </w:rPr>
+        <w:t xml:space="preserve">como solução, </w:t>
+      </w:r>
+      <w:r>
+        <w:rPr>
+          <w:rFonts w:ascii="Arial" w:eastAsia="Arial" w:hAnsi="Arial" w:cs="Arial"/>
+          <w:color w:val="222222"/>
+          <w:lang w:val="en-US"/>
+        </w:rPr>
+        <w:t>o desenvolvimento de um dashboard</w:t>
+      </w:r>
+      <w:r>
+        <w:rPr>
+          <w:rFonts w:ascii="Arial" w:eastAsia="Arial" w:hAnsi="Arial" w:cs="Arial"/>
+          <w:color w:val="222222"/>
+          <w:lang w:val="en-US"/>
+        </w:rPr>
+        <w:t>,</w:t>
+      </w:r>
+      <w:r>
+        <w:rPr>
+          <w:rFonts w:ascii="Arial" w:eastAsia="Arial" w:hAnsi="Arial" w:cs="Arial"/>
+          <w:color w:val="222222"/>
+          <w:lang w:val="en-US"/>
+        </w:rPr>
+        <w:t xml:space="preserve"> voltado ao setor de agronomia, estruturado como um painel centralizado capaz de converter dados operacionais em indicadores visuais claros, precisos e de fácil interpretação.</w:t>
+      </w:r>
+    </w:p>
+    <w:p>
+      <w:pPr>
+        <w:shd w:val="clear" w:color="auto" w:fill="FFFFFF" w:themeFill="background1"/>
+        <w:spacing w:before="24" w:after="0" w:line="360" w:lineRule="auto"/>
+        <w:ind w:firstLine="283"/>
+        <w:contextualSpacing/>
+        <w:jc w:val="both"/>
+        <w:rPr>
+          <w:rFonts w:ascii="Arial" w:eastAsia="Arial" w:hAnsi="Arial" w:cs="Arial"/>
+          <w:color w:val="222222"/>
+        </w:rPr>
+      </w:pPr>
+      <w:r>
+        <w:rPr>
+          <w:rFonts w:ascii="Arial" w:eastAsia="Arial" w:hAnsi="Arial" w:cs="Arial"/>
+          <w:color w:val="222222"/>
+        </w:rPr>
+        <w:t xml:space="preserve">O sistema tem como objetivo organizar e apresentar dados estratégicos relacionados a produtos, colaboradores, clientes, vendas, lucros e custos, permitindo uma </w:t>
+      </w:r>
+      <w:r>
+        <w:rPr>
+          <w:rFonts w:ascii="Arial" w:eastAsia="Arial" w:hAnsi="Arial" w:cs="Arial"/>
+          <w:color w:val="222222"/>
+        </w:rPr>
+        <w:t>inspeção</w:t>
+      </w:r>
+      <w:r>
+        <w:rPr>
+          <w:rFonts w:ascii="Arial" w:eastAsia="Arial" w:hAnsi="Arial" w:cs="Arial"/>
+          <w:color w:val="222222"/>
+        </w:rPr>
+        <w:t xml:space="preserve"> </w:t>
+      </w:r>
+      <w:r>
+        <w:rPr>
+          <w:rFonts w:ascii="Arial" w:eastAsia="Arial" w:hAnsi="Arial" w:cs="Arial"/>
+          <w:color w:val="222222"/>
+        </w:rPr>
+        <w:t xml:space="preserve">mais </w:t>
+      </w:r>
+      <w:r>
+        <w:rPr>
+          <w:rFonts w:ascii="Arial" w:eastAsia="Arial" w:hAnsi="Arial" w:cs="Arial"/>
+          <w:color w:val="222222"/>
+        </w:rPr>
+        <w:t>estruturada do desempenho comercial. Por meio de recursos de filtragem e comparação, será possível realizar análises detalhadas a partir de critérios como categorias, regiões, períodos e tipos de produtos, ampliando a compreensão sobre o comportamento das vendas.</w:t>
+      </w:r>
+    </w:p>
+    <w:p>
+      <w:pPr>
+        <w:shd w:val="clear" w:color="auto" w:fill="FFFFFF" w:themeFill="background1"/>
+        <w:spacing w:before="24" w:after="0" w:line="360" w:lineRule="auto"/>
+        <w:ind w:firstLine="283"/>
+        <w:contextualSpacing/>
+        <w:jc w:val="both"/>
+        <w:rPr>
+          <w:rFonts w:ascii="Arial" w:eastAsia="Arial" w:hAnsi="Arial" w:cs="Arial"/>
+          <w:color w:val="222222"/>
+          <w:lang w:val="en-US"/>
+        </w:rPr>
+      </w:pPr>
+      <w:r>
+        <w:rPr>
+          <w:rFonts w:ascii="Arial" w:eastAsia="Arial" w:hAnsi="Arial" w:cs="Arial"/>
+          <w:color w:val="222222"/>
+          <w:lang w:val="en-US"/>
+        </w:rPr>
+        <w:t>Assim, o dashboard busca fortalecer a gestão orientada por dados, minimizando suposições e promovendo maior eficiência no controle gerencial, no monitoramento de metas e no processo decisório no contexto da agronomia.</w:t>
+      </w:r>
+    </w:p>
+    <w:p>
+      <w:pPr>
+        <w:spacing w:after="0" w:line="360" w:lineRule="auto"/>
+        <w:ind w:firstLine="283"/>
+        <w:contextualSpacing/>
+        <w:rPr>
+          <w:rFonts w:ascii="Arial" w:eastAsia="Arial" w:hAnsi="Arial" w:cs="Arial"/>
+          <w:b/>
+          <w:bCs/>
+          <w:sz w:val="28"/>
+          <w:szCs w:val="28"/>
+          <w:lang w:val="en-US"/>
+        </w:rPr>
+      </w:pPr>
+    </w:p>
+    <w:p>
+      <w:pPr>
+        <w:spacing w:after="0" w:line="360" w:lineRule="auto"/>
+        <w:ind w:firstLine="283"/>
+        <w:contextualSpacing/>
+        <w:rPr>
+          <w:rFonts w:ascii="Arial" w:eastAsia="Arial" w:hAnsi="Arial" w:cs="Arial"/>
+          <w:b/>
+          <w:bCs/>
+          <w:sz w:val="28"/>
+          <w:szCs w:val="28"/>
+          <w:lang w:val="en-US"/>
+        </w:rPr>
+      </w:pPr>
+    </w:p>
+    <w:p>
+      <w:pPr>
+        <w:spacing w:after="0" w:line="360" w:lineRule="auto"/>
+        <w:ind w:firstLine="283"/>
+        <w:contextualSpacing/>
+        <w:rPr>
+          <w:rFonts w:ascii="Arial" w:eastAsia="Arial" w:hAnsi="Arial" w:cs="Arial"/>
+          <w:b/>
+          <w:bCs/>
+          <w:sz w:val="28"/>
+          <w:szCs w:val="28"/>
+          <w:lang w:val="en-US"/>
+        </w:rPr>
+      </w:pPr>
+    </w:p>
+    <w:p>
+      <w:pPr>
+        <w:spacing w:after="0" w:line="360" w:lineRule="auto"/>
+        <w:ind w:firstLine="283"/>
+        <w:contextualSpacing/>
+        <w:rPr>
+          <w:rFonts w:ascii="Arial" w:eastAsia="Arial" w:hAnsi="Arial" w:cs="Arial"/>
+          <w:b/>
+          <w:bCs/>
+          <w:sz w:val="28"/>
+          <w:szCs w:val="28"/>
+          <w:lang w:val="en-US"/>
+        </w:rPr>
+      </w:pPr>
+    </w:p>
+    <w:p>
+      <w:pPr>
+        <w:spacing w:after="0" w:line="360" w:lineRule="auto"/>
+        <w:ind w:firstLine="283"/>
+        <w:contextualSpacing/>
+        <w:rPr>
+          <w:rFonts w:ascii="Arial" w:eastAsia="Arial" w:hAnsi="Arial" w:cs="Arial"/>
+          <w:b/>
+          <w:bCs/>
+          <w:sz w:val="28"/>
+          <w:szCs w:val="28"/>
+          <w:lang w:val="en-US"/>
+        </w:rPr>
+      </w:pPr>
+    </w:p>
+    <w:p>
+      <w:pPr>
+        <w:spacing w:after="0" w:line="360" w:lineRule="auto"/>
+        <w:ind w:firstLine="283"/>
+        <w:contextualSpacing/>
+        <w:rPr>
+          <w:rFonts w:ascii="Arial" w:eastAsia="Arial" w:hAnsi="Arial" w:cs="Arial"/>
+          <w:b/>
+          <w:bCs/>
+          <w:sz w:val="28"/>
+          <w:szCs w:val="28"/>
+          <w:lang w:val="en-US"/>
+        </w:rPr>
+      </w:pPr>
+    </w:p>
+    <w:p>
+      <w:pPr>
+        <w:spacing w:after="0" w:line="360" w:lineRule="auto"/>
+        <w:ind w:firstLine="283"/>
+        <w:contextualSpacing/>
+        <w:rPr>
+          <w:rFonts w:ascii="Arial" w:eastAsia="Arial" w:hAnsi="Arial" w:cs="Arial"/>
+          <w:b/>
+          <w:bCs/>
+          <w:sz w:val="28"/>
+          <w:szCs w:val="28"/>
+          <w:lang w:val="en-US"/>
+        </w:rPr>
+      </w:pPr>
+    </w:p>
+    <w:p>
+      <w:pPr>
+        <w:spacing w:after="0" w:line="360" w:lineRule="auto"/>
+        <w:ind w:firstLine="283"/>
+        <w:contextualSpacing/>
+        <w:rPr>
+          <w:rFonts w:ascii="Arial" w:eastAsia="Arial" w:hAnsi="Arial" w:cs="Arial"/>
+          <w:b/>
+          <w:bCs/>
+          <w:sz w:val="28"/>
+          <w:szCs w:val="28"/>
+          <w:lang w:val="en-US"/>
+        </w:rPr>
+      </w:pPr>
+    </w:p>
+    <w:p>
+      <w:pPr>
+        <w:spacing w:after="0" w:line="360" w:lineRule="auto"/>
+        <w:ind w:firstLine="283"/>
+        <w:contextualSpacing/>
+        <w:rPr>
+          <w:rFonts w:ascii="Arial" w:eastAsia="Arial" w:hAnsi="Arial" w:cs="Arial"/>
+          <w:b/>
+          <w:bCs/>
+          <w:sz w:val="28"/>
+          <w:szCs w:val="28"/>
+          <w:lang w:val="en-US"/>
+        </w:rPr>
+      </w:pPr>
+    </w:p>
+    <w:p>
+      <w:pPr>
+        <w:spacing w:after="0" w:line="360" w:lineRule="auto"/>
+        <w:ind w:firstLine="283"/>
+        <w:contextualSpacing/>
+        <w:rPr>
+          <w:rFonts w:ascii="Arial" w:eastAsia="Arial" w:hAnsi="Arial" w:cs="Arial"/>
+          <w:b/>
+          <w:bCs/>
+          <w:sz w:val="28"/>
+          <w:szCs w:val="28"/>
+          <w:lang w:val="en-US"/>
+        </w:rPr>
+      </w:pPr>
+    </w:p>
+    <w:p>
+      <w:pPr>
+        <w:spacing w:after="0" w:line="360" w:lineRule="auto"/>
+        <w:ind w:firstLine="283"/>
+        <w:contextualSpacing/>
+        <w:rPr>
+          <w:rFonts w:ascii="Arial" w:eastAsia="Arial" w:hAnsi="Arial" w:cs="Arial"/>
+          <w:b/>
+          <w:bCs/>
+          <w:sz w:val="28"/>
+          <w:szCs w:val="28"/>
+          <w:lang w:val="en-US"/>
+        </w:rPr>
+      </w:pPr>
+    </w:p>
+    <w:p>
+      <w:pPr>
+        <w:spacing w:after="0" w:line="360" w:lineRule="auto"/>
+        <w:ind w:firstLine="283"/>
+        <w:contextualSpacing/>
+        <w:rPr>
+          <w:rFonts w:ascii="Arial" w:eastAsia="Arial" w:hAnsi="Arial" w:cs="Arial"/>
+          <w:b/>
+          <w:bCs/>
+          <w:sz w:val="28"/>
+          <w:szCs w:val="28"/>
+          <w:lang w:val="en-US"/>
+        </w:rPr>
+      </w:pPr>
+    </w:p>
+    <w:p>
+      <w:pPr>
+        <w:spacing w:after="0" w:line="360" w:lineRule="auto"/>
+        <w:ind w:firstLine="283"/>
+        <w:contextualSpacing/>
+        <w:rPr>
+          <w:rFonts w:ascii="Arial" w:eastAsia="Arial" w:hAnsi="Arial" w:cs="Arial"/>
+          <w:b/>
+          <w:bCs/>
+          <w:sz w:val="28"/>
+          <w:szCs w:val="28"/>
+          <w:lang w:val="en-US"/>
+        </w:rPr>
+      </w:pPr>
+    </w:p>
+    <w:p>
+      <w:pPr>
+        <w:spacing w:after="0" w:line="360" w:lineRule="auto"/>
+        <w:ind w:firstLine="283"/>
+        <w:contextualSpacing/>
+        <w:rPr>
+          <w:rFonts w:ascii="Arial" w:eastAsia="Arial" w:hAnsi="Arial" w:cs="Arial"/>
+          <w:b/>
+          <w:bCs/>
+          <w:sz w:val="28"/>
+          <w:szCs w:val="28"/>
+          <w:lang w:val="en-US"/>
+        </w:rPr>
+      </w:pPr>
+    </w:p>
+    <w:p>
+      <w:pPr>
+        <w:spacing w:after="0" w:line="360" w:lineRule="auto"/>
+        <w:ind w:firstLine="283"/>
+        <w:contextualSpacing/>
+        <w:rPr>
+          <w:rFonts w:ascii="Arial" w:eastAsia="Arial" w:hAnsi="Arial" w:cs="Arial"/>
+          <w:b/>
+          <w:bCs/>
+          <w:sz w:val="28"/>
+          <w:szCs w:val="28"/>
+          <w:lang w:val="en-US"/>
+        </w:rPr>
+      </w:pPr>
+      <w:r>
+        <w:rPr>
+          <w:rFonts w:ascii="Arial" w:eastAsia="Arial" w:hAnsi="Arial" w:cs="Arial"/>
+          <w:b/>
+          <w:bCs/>
+          <w:sz w:val="28"/>
+          <w:szCs w:val="28"/>
+          <w:lang w:val="en-US"/>
+        </w:rPr>
+        <w:lastRenderedPageBreak/>
+        <w:t>2 DESENVOLVIMENTO</w:t>
+      </w:r>
+    </w:p>
+    <w:p>
+      <w:pPr>
+        <w:spacing w:after="0" w:line="360" w:lineRule="auto"/>
+        <w:ind w:firstLine="283"/>
+        <w:contextualSpacing/>
+        <w:rPr>
+          <w:rFonts w:ascii="Arial" w:eastAsia="Arial" w:hAnsi="Arial" w:cs="Arial"/>
+          <w:bCs/>
+          <w:lang w:val="en-US"/>
+        </w:rPr>
+      </w:pPr>
+      <w:r>
+        <w:rPr>
+          <w:rFonts w:ascii="Arial" w:eastAsia="Arial" w:hAnsi="Arial" w:cs="Arial"/>
+          <w:bCs/>
+          <w:lang w:val="en-US"/>
+        </w:rPr>
+        <w:t xml:space="preserve">O desenvolvinento do dashboard Agrofluxo tem como o principal foco na criação de uma plataforma inteligente de dados voltada à gestão centralizada de propriedades rurais, unificando indicadores criticos para o sucesso da safra. O pronto alto do dashboard consiste na capacidade de tranformar registros de campo e dados brutos emu ma vizualização estrategica permitindo assim que </w:t>
       </w:r>
       <w:proofErr w:type="spellStart"/>
       <w:r>
         <w:rPr>
           <w:rFonts w:ascii="Arial" w:eastAsia="Arial" w:hAnsi="Arial" w:cs="Arial"/>
-          <w:color w:val="222222"/>
-          <w:lang w:val="en-US"/>
-        </w:rPr>
-        <w:t>atual</w:t>
+          <w:bCs/>
+          <w:lang w:val="en-US"/>
+        </w:rPr>
+        <w:t>o</w:t>
       </w:r>
       <w:proofErr w:type="spellEnd"/>
       <w:r>
         <w:rPr>
           <w:rFonts w:ascii="Arial" w:eastAsia="Arial" w:hAnsi="Arial" w:cs="Arial"/>
-          <w:color w:val="222222"/>
+          <w:bCs/>
+          <w:lang w:val="en-US"/>
+        </w:rPr>
+        <w:t xml:space="preserve"> produtor possa agir de forma preventica e não apenas reativa.</w:t>
+      </w:r>
+    </w:p>
+    <w:p>
+      <w:pPr>
+        <w:spacing w:after="0" w:line="360" w:lineRule="auto"/>
+        <w:ind w:firstLine="283"/>
+        <w:contextualSpacing/>
+        <w:rPr>
+          <w:rFonts w:ascii="Arial" w:eastAsia="Arial" w:hAnsi="Arial" w:cs="Arial"/>
+          <w:bCs/>
+          <w:lang w:val="en-US"/>
+        </w:rPr>
+      </w:pPr>
+      <w:r>
+        <w:rPr>
+          <w:rFonts w:ascii="Arial" w:eastAsia="Arial" w:hAnsi="Arial" w:cs="Arial"/>
+          <w:bCs/>
+          <w:lang w:val="en-US"/>
+        </w:rPr>
+        <w:t>Para o desenvolvimento do dashboard</w:t>
+      </w:r>
+      <w:r>
+        <w:rPr>
+          <w:rFonts w:ascii="Arial" w:eastAsia="Arial" w:hAnsi="Arial" w:cs="Arial"/>
+          <w:bCs/>
           <w:lang w:val="en-US"/>
         </w:rPr>
         <w:t xml:space="preserve"> </w:t>
       </w:r>
-      <w:proofErr w:type="spellStart"/>
-      <w:r>
-        <w:rPr>
-          <w:rFonts w:ascii="Arial" w:eastAsia="Arial" w:hAnsi="Arial" w:cs="Arial"/>
-          <w:color w:val="222222"/>
-          <w:lang w:val="en-US"/>
-        </w:rPr>
-        <w:t>projeto</w:t>
-      </w:r>
-      <w:proofErr w:type="spellEnd"/>
-      <w:r>
-        <w:rPr>
-          <w:rFonts w:ascii="Arial" w:eastAsia="Arial" w:hAnsi="Arial" w:cs="Arial"/>
-          <w:color w:val="222222"/>
-          <w:lang w:val="en-US"/>
-        </w:rPr>
-        <w:t xml:space="preserve"> </w:t>
-      </w:r>
-      <w:proofErr w:type="spellStart"/>
-      <w:r>
-        <w:rPr>
-          <w:rFonts w:ascii="Arial" w:eastAsia="Arial" w:hAnsi="Arial" w:cs="Arial"/>
-          <w:color w:val="222222"/>
-          <w:lang w:val="en-US"/>
-        </w:rPr>
-        <w:t>propõe</w:t>
-      </w:r>
-      <w:proofErr w:type="spellEnd"/>
-      <w:r>
-        <w:rPr>
-          <w:rFonts w:ascii="Arial" w:eastAsia="Arial" w:hAnsi="Arial" w:cs="Arial"/>
-          <w:color w:val="222222"/>
-          <w:lang w:val="en-US"/>
-        </w:rPr>
-        <w:t xml:space="preserve"> </w:t>
-      </w:r>
-      <w:proofErr w:type="spellStart"/>
-      <w:r>
-        <w:rPr>
-          <w:rFonts w:ascii="Arial" w:eastAsia="Arial" w:hAnsi="Arial" w:cs="Arial"/>
-          <w:color w:val="222222"/>
-          <w:lang w:val="en-US"/>
-        </w:rPr>
-        <w:t>como</w:t>
-      </w:r>
-      <w:proofErr w:type="spellEnd"/>
-      <w:r>
-        <w:rPr>
-          <w:rFonts w:ascii="Arial" w:eastAsia="Arial" w:hAnsi="Arial" w:cs="Arial"/>
-          <w:color w:val="222222"/>
-          <w:lang w:val="en-US"/>
-        </w:rPr>
-        <w:t xml:space="preserve"> </w:t>
-      </w:r>
-      <w:proofErr w:type="spellStart"/>
-      <w:r>
-        <w:rPr>
-          <w:rFonts w:ascii="Arial" w:eastAsia="Arial" w:hAnsi="Arial" w:cs="Arial"/>
-          <w:color w:val="222222"/>
-          <w:lang w:val="en-US"/>
-        </w:rPr>
-        <w:t>solução</w:t>
-      </w:r>
-      <w:proofErr w:type="spellEnd"/>
-      <w:r>
-        <w:rPr>
-          <w:rFonts w:ascii="Arial" w:eastAsia="Arial" w:hAnsi="Arial" w:cs="Arial"/>
-          <w:color w:val="222222"/>
-          <w:lang w:val="en-US"/>
-        </w:rPr>
-        <w:t xml:space="preserve">, </w:t>
-      </w:r>
-      <w:r>
-        <w:rPr>
-          <w:rFonts w:ascii="Arial" w:eastAsia="Arial" w:hAnsi="Arial" w:cs="Arial"/>
-          <w:color w:val="222222"/>
-          <w:lang w:val="en-US"/>
-        </w:rPr>
-        <w:t xml:space="preserve">o </w:t>
-      </w:r>
-      <w:proofErr w:type="spellStart"/>
-      <w:r>
-        <w:rPr>
-          <w:rFonts w:ascii="Arial" w:eastAsia="Arial" w:hAnsi="Arial" w:cs="Arial"/>
-          <w:color w:val="222222"/>
-          <w:lang w:val="en-US"/>
-        </w:rPr>
-        <w:t>desenvolvimento</w:t>
-      </w:r>
-      <w:proofErr w:type="spellEnd"/>
-      <w:r>
-        <w:rPr>
-          <w:rFonts w:ascii="Arial" w:eastAsia="Arial" w:hAnsi="Arial" w:cs="Arial"/>
-          <w:color w:val="222222"/>
-          <w:lang w:val="en-US"/>
-        </w:rPr>
-        <w:t xml:space="preserve"> de um dashboard</w:t>
-      </w:r>
-      <w:r>
-        <w:rPr>
-          <w:rFonts w:ascii="Arial" w:eastAsia="Arial" w:hAnsi="Arial" w:cs="Arial"/>
-          <w:color w:val="222222"/>
-          <w:lang w:val="en-US"/>
-        </w:rPr>
-        <w:t>,</w:t>
+      <w:r>
+        <w:rPr>
+          <w:rFonts w:ascii="Arial" w:eastAsia="Arial" w:hAnsi="Arial" w:cs="Arial"/>
+          <w:bCs/>
+          <w:lang w:val="en-US"/>
+        </w:rPr>
+        <w:t xml:space="preserve">foi utilizado a metodologia ágil, permitindo a flexibilidade e </w:t>
+      </w:r>
+      <w:proofErr w:type="gramStart"/>
+      <w:r>
+        <w:rPr>
+          <w:rFonts w:ascii="Arial" w:eastAsia="Arial" w:hAnsi="Arial" w:cs="Arial"/>
+          <w:bCs/>
+          <w:lang w:val="en-US"/>
+        </w:rPr>
+        <w:t>a</w:t>
+      </w:r>
+      <w:proofErr w:type="gramEnd"/>
+      <w:r>
+        <w:rPr>
+          <w:rFonts w:ascii="Arial" w:eastAsia="Arial" w:hAnsi="Arial" w:cs="Arial"/>
+          <w:bCs/>
+          <w:lang w:val="en-US"/>
+        </w:rPr>
+        <w:t xml:space="preserve"> adaptação continua ao longo do processo. O dashboard foi construido utilizando o Framework Reac</w:t>
+      </w:r>
+      <w:r>
+        <w:rPr>
+          <w:rFonts w:ascii="Arial" w:eastAsia="Arial" w:hAnsi="Arial" w:cs="Arial"/>
+          <w:bCs/>
+          <w:lang w:val="en-US"/>
+        </w:rPr>
+        <w:t>t Native e a linguagem JavaScript para a criação gráficas das telas. Para o backend, foi escolhido Node.js, que facilita à integração com as APIs, e o SQL e o banco de dados PhpMyAdmin para o armazenamentos dos dados fornecidos pelo usuários.</w:t>
+      </w:r>
+    </w:p>
+    <w:p>
+      <w:pPr>
+        <w:spacing w:after="0" w:line="360" w:lineRule="auto"/>
+        <w:ind w:firstLine="283"/>
+        <w:contextualSpacing/>
+        <w:rPr>
+          <w:rFonts w:ascii="Arial" w:eastAsia="Arial" w:hAnsi="Arial" w:cs="Arial"/>
+          <w:bCs/>
+          <w:lang w:val="en-US"/>
+        </w:rPr>
+      </w:pPr>
+    </w:p>
+    <w:p>
+      <w:pPr>
+        <w:spacing w:after="0" w:line="360" w:lineRule="auto"/>
+        <w:contextualSpacing/>
+        <w:rPr>
+          <w:rFonts w:ascii="Arial" w:eastAsia="Arial" w:hAnsi="Arial" w:cs="Arial"/>
+          <w:b/>
+          <w:bCs/>
+          <w:sz w:val="28"/>
+          <w:szCs w:val="28"/>
+          <w:lang w:val="en-US"/>
+        </w:rPr>
+      </w:pPr>
+    </w:p>
+    <w:p>
+      <w:pPr>
+        <w:spacing w:after="0" w:line="360" w:lineRule="auto"/>
+        <w:ind w:firstLine="283"/>
+        <w:contextualSpacing/>
+        <w:rPr>
+          <w:rFonts w:ascii="Arial" w:eastAsia="Arial" w:hAnsi="Arial" w:cs="Arial"/>
+          <w:b/>
+          <w:bCs/>
+          <w:sz w:val="28"/>
+          <w:szCs w:val="28"/>
+          <w:lang w:val="en-US"/>
+        </w:rPr>
+      </w:pPr>
+      <w:r>
+        <w:rPr>
+          <w:rFonts w:ascii="Arial" w:eastAsia="Arial" w:hAnsi="Arial" w:cs="Arial"/>
+          <w:b/>
+          <w:bCs/>
+          <w:sz w:val="28"/>
+          <w:szCs w:val="28"/>
+          <w:lang w:val="en-US"/>
+        </w:rPr>
+        <w:t>2.1 Objetivo geral</w:t>
+      </w:r>
+    </w:p>
+    <w:p>
+      <w:pPr>
+        <w:spacing w:after="0" w:line="360" w:lineRule="auto"/>
+        <w:ind w:firstLine="283"/>
+        <w:contextualSpacing/>
+        <w:rPr>
+          <w:rFonts w:ascii="Arial" w:eastAsia="Arial" w:hAnsi="Arial" w:cs="Arial"/>
+          <w:bCs/>
+          <w:lang w:val="en-US"/>
+        </w:rPr>
+      </w:pPr>
+      <w:r>
+        <w:rPr>
+          <w:rFonts w:ascii="Arial" w:eastAsia="Arial" w:hAnsi="Arial" w:cs="Arial"/>
+          <w:bCs/>
+          <w:lang w:val="en-US"/>
+        </w:rPr>
+        <w:t xml:space="preserve">O objetivo do AgroFluxo é </w:t>
+      </w:r>
+      <w:proofErr w:type="gramStart"/>
+      <w:r>
+        <w:rPr>
+          <w:rFonts w:ascii="Arial" w:eastAsia="Arial" w:hAnsi="Arial" w:cs="Arial"/>
+          <w:bCs/>
+          <w:lang w:val="en-US"/>
+        </w:rPr>
+        <w:t>a</w:t>
+      </w:r>
+      <w:proofErr w:type="gramEnd"/>
+      <w:r>
+        <w:rPr>
+          <w:rFonts w:ascii="Arial" w:eastAsia="Arial" w:hAnsi="Arial" w:cs="Arial"/>
+          <w:bCs/>
+          <w:lang w:val="en-US"/>
+        </w:rPr>
+        <w:t xml:space="preserve"> integridade do produtor com o campo com informações de f</w:t>
+      </w:r>
+      <w:r>
+        <w:rPr>
+          <w:rFonts w:ascii="Arial" w:eastAsia="Arial" w:hAnsi="Arial" w:cs="Arial"/>
+          <w:bCs/>
+          <w:lang w:val="en-US"/>
+        </w:rPr>
+        <w:t>a</w:t>
+      </w:r>
+      <w:r>
+        <w:rPr>
+          <w:rFonts w:ascii="Arial" w:eastAsia="Arial" w:hAnsi="Arial" w:cs="Arial"/>
+          <w:bCs/>
+          <w:lang w:val="en-US"/>
+        </w:rPr>
+        <w:t>cil entendimento, com um ótimo gerenciamento d</w:t>
+      </w:r>
+      <w:r>
+        <w:rPr>
+          <w:rFonts w:ascii="Arial" w:eastAsia="Arial" w:hAnsi="Arial" w:cs="Arial"/>
+          <w:bCs/>
+          <w:lang w:val="en-US"/>
+        </w:rPr>
+        <w:t>e dados brutos do campo para um simples dashboard, visando sempre na simplicidade da leitura do campo.</w:t>
+      </w:r>
+    </w:p>
+    <w:p>
+      <w:pPr>
+        <w:spacing w:after="0" w:line="360" w:lineRule="auto"/>
+        <w:contextualSpacing/>
+        <w:rPr>
+          <w:rFonts w:ascii="Arial" w:eastAsia="Arial" w:hAnsi="Arial" w:cs="Arial"/>
+          <w:bCs/>
+          <w:sz w:val="28"/>
+          <w:szCs w:val="28"/>
+          <w:lang w:val="en-US"/>
+        </w:rPr>
+      </w:pPr>
+      <w:r>
+        <w:rPr>
+          <w:rFonts w:ascii="Arial" w:eastAsia="Arial" w:hAnsi="Arial" w:cs="Arial"/>
+          <w:bCs/>
+          <w:sz w:val="28"/>
+          <w:szCs w:val="28"/>
+          <w:lang w:val="en-US"/>
+        </w:rPr>
+        <w:tab/>
+      </w:r>
+    </w:p>
+    <w:p>
+      <w:pPr>
+        <w:spacing w:after="0" w:line="360" w:lineRule="auto"/>
+        <w:ind w:firstLine="283"/>
+        <w:contextualSpacing/>
+        <w:rPr>
+          <w:rFonts w:ascii="Arial" w:eastAsia="Arial" w:hAnsi="Arial" w:cs="Arial"/>
+          <w:b/>
+          <w:bCs/>
+          <w:sz w:val="28"/>
+          <w:szCs w:val="28"/>
+          <w:lang w:val="en-US"/>
+        </w:rPr>
+      </w:pPr>
+      <w:r>
+        <w:rPr>
+          <w:rFonts w:ascii="Arial" w:eastAsia="Arial" w:hAnsi="Arial" w:cs="Arial"/>
+          <w:b/>
+          <w:bCs/>
+          <w:sz w:val="28"/>
+          <w:szCs w:val="28"/>
+          <w:lang w:val="en-US"/>
+        </w:rPr>
+        <w:t xml:space="preserve">2.2 Objetivo específico </w:t>
       </w:r>
       <w:bookmarkStart w:id="0" w:name="_GoBack"/>
       <w:bookmarkEnd w:id="0"/>
-      <w:r>
-        <w:rPr>
-          <w:rFonts w:ascii="Arial" w:eastAsia="Arial" w:hAnsi="Arial" w:cs="Arial"/>
-          <w:color w:val="222222"/>
-          <w:lang w:val="en-US"/>
-        </w:rPr>
-        <w:t xml:space="preserve"> voltado ao setor de agronomia, estruturado como um painel centralizado capaz de converter dados operacionais em indicadores visuais claros, precisos e de fácil interpretação.</w:t>
-      </w:r>
-    </w:p>
-    <w:p>
-      <w:pPr>
-        <w:shd w:val="clear" w:color="auto" w:fill="FFFFFF" w:themeFill="background1"/>
-        <w:spacing w:before="24" w:after="0" w:line="360" w:lineRule="auto"/>
-        <w:ind w:firstLine="283"/>
-        <w:contextualSpacing/>
-        <w:jc w:val="both"/>
-        <w:rPr>
-          <w:rFonts w:ascii="Arial" w:eastAsia="Arial" w:hAnsi="Arial" w:cs="Arial"/>
-          <w:color w:val="222222"/>
-        </w:rPr>
-      </w:pPr>
-      <w:r>
-        <w:rPr>
-          <w:rFonts w:ascii="Arial" w:eastAsia="Arial" w:hAnsi="Arial" w:cs="Arial"/>
-          <w:color w:val="222222"/>
-        </w:rPr>
-        <w:t xml:space="preserve">O sistema tem como objetivo organizar e apresentar dados estratégicos relacionados a produtos, colaboradores, clientes, vendas, lucros e custos, permitindo uma </w:t>
-      </w:r>
-      <w:r>
-        <w:rPr>
-          <w:rFonts w:ascii="Arial" w:eastAsia="Arial" w:hAnsi="Arial" w:cs="Arial"/>
-          <w:color w:val="222222"/>
-        </w:rPr>
-        <w:t>inspeção</w:t>
-      </w:r>
-      <w:r>
-        <w:rPr>
-          <w:rFonts w:ascii="Arial" w:eastAsia="Arial" w:hAnsi="Arial" w:cs="Arial"/>
-          <w:color w:val="222222"/>
-        </w:rPr>
-        <w:t xml:space="preserve"> </w:t>
-      </w:r>
-      <w:r>
-        <w:rPr>
-          <w:rFonts w:ascii="Arial" w:eastAsia="Arial" w:hAnsi="Arial" w:cs="Arial"/>
-          <w:color w:val="222222"/>
-        </w:rPr>
-        <w:t xml:space="preserve">mais </w:t>
-      </w:r>
-      <w:r>
-        <w:rPr>
-          <w:rFonts w:ascii="Arial" w:eastAsia="Arial" w:hAnsi="Arial" w:cs="Arial"/>
-          <w:color w:val="222222"/>
-        </w:rPr>
-        <w:t>estruturada do desempenho comercial. Por meio de recursos de filtragem e comparação, será possível realizar análises detalhadas a partir de critérios como categorias, regiões, períodos e tipos de produtos, ampliando a compreensão sobre o comportamento das vendas.</w:t>
-      </w:r>
-    </w:p>
-    <w:p>
-      <w:pPr>
-        <w:shd w:val="clear" w:color="auto" w:fill="FFFFFF" w:themeFill="background1"/>
-        <w:spacing w:before="24" w:after="0" w:line="360" w:lineRule="auto"/>
-        <w:ind w:firstLine="283"/>
-        <w:contextualSpacing/>
-        <w:jc w:val="both"/>
-        <w:rPr>
-          <w:rFonts w:ascii="Arial" w:eastAsia="Arial" w:hAnsi="Arial" w:cs="Arial"/>
-          <w:color w:val="222222"/>
-          <w:lang w:val="en-US"/>
-        </w:rPr>
-      </w:pPr>
-      <w:r>
-        <w:rPr>
-          <w:rFonts w:ascii="Arial" w:eastAsia="Arial" w:hAnsi="Arial" w:cs="Arial"/>
-          <w:color w:val="222222"/>
-          <w:lang w:val="en-US"/>
-        </w:rPr>
-        <w:t>Assim, o dashboard busca fortalecer a gestão orientada por dados, minimizando suposições e promovendo maior eficiência no controle gerencial, no monitoramento de metas e no processo decisório no contexto da agronomia.</w:t>
-      </w:r>
-    </w:p>
-    <w:p>
-      <w:pPr>
-        <w:spacing w:after="0" w:line="360" w:lineRule="auto"/>
-        <w:ind w:firstLine="283"/>
-        <w:contextualSpacing/>
-        <w:rPr>
-          <w:rFonts w:ascii="Arial" w:eastAsia="Arial" w:hAnsi="Arial" w:cs="Arial"/>
-          <w:b/>
-          <w:bCs/>
-          <w:sz w:val="28"/>
-          <w:szCs w:val="28"/>
-          <w:lang w:val="en-US"/>
-        </w:rPr>
-      </w:pPr>
+    </w:p>
+    <w:p>
+      <w:pPr>
+        <w:spacing w:after="0" w:line="360" w:lineRule="auto"/>
+        <w:ind w:firstLine="283"/>
+        <w:contextualSpacing/>
+        <w:rPr>
+          <w:rFonts w:ascii="Arial" w:eastAsia="Arial" w:hAnsi="Arial" w:cs="Arial"/>
+          <w:bCs/>
+          <w:lang w:val="en-US"/>
+        </w:rPr>
+      </w:pPr>
+      <w:r>
+        <w:rPr>
+          <w:rFonts w:ascii="Arial" w:eastAsia="Arial" w:hAnsi="Arial" w:cs="Arial"/>
+          <w:bCs/>
+          <w:lang w:val="en-US"/>
+        </w:rPr>
+        <w:t xml:space="preserve">O </w:t>
+      </w:r>
+      <w:r>
+        <w:rPr>
+          <w:rFonts w:ascii="Arial" w:eastAsia="Arial" w:hAnsi="Arial" w:cs="Arial"/>
+          <w:bCs/>
+          <w:lang w:val="en-US"/>
+        </w:rPr>
+        <w:t xml:space="preserve">AgroFluxo tem como o principal objetivo integrar a gestão operacional e financeira em um fluxo continuo, monitiorando o desempenho maquinário em tempo real para reduzir o tempo de ociosidade e desperdicio de combustivel. Os indicadores de produtividade comparam o rendimento real por hectare com as metas estimadas, enquanto o controle de custos, </w:t>
+      </w:r>
+      <w:r>
+        <w:rPr>
+          <w:rFonts w:ascii="Arial" w:eastAsia="Arial" w:hAnsi="Arial" w:cs="Arial"/>
+          <w:bCs/>
+          <w:lang w:val="en-US"/>
+        </w:rPr>
+        <w:t>à</w:t>
+      </w:r>
+      <w:r>
+        <w:rPr>
+          <w:rFonts w:ascii="Arial" w:eastAsia="Arial" w:hAnsi="Arial" w:cs="Arial"/>
+          <w:bCs/>
+          <w:lang w:val="en-US"/>
+        </w:rPr>
+        <w:t xml:space="preserve"> entrada de produtos</w:t>
+      </w:r>
+      <w:r>
+        <w:rPr>
+          <w:rFonts w:ascii="Arial" w:eastAsia="Arial" w:hAnsi="Arial" w:cs="Arial"/>
+          <w:bCs/>
+          <w:lang w:val="en-US"/>
+        </w:rPr>
+        <w:t xml:space="preserve"> e informações da empresa detalha de forma mais clean para os produtores.</w:t>
+      </w:r>
     </w:p>
     <w:sectPr>
-      <w:headerReference w:type="default" r:id="rId8"/>
-      <w:footerReference w:type="default" r:id="rId9"/>
-      <w:headerReference w:type="first" r:id="rId10"/>
-      <w:footerReference w:type="first" r:id="rId11"/>
+      <w:headerReference w:type="default" r:id="rId9"/>
+      <w:footerReference w:type="default" r:id="rId10"/>
+      <w:headerReference w:type="first" r:id="rId11"/>
+      <w:footerReference w:type="first" r:id="rId12"/>
       <w:pgSz w:w="11906" w:h="16838"/>
       <w:pgMar w:top="1440" w:right="1440" w:bottom="1440" w:left="1440" w:header="720" w:footer="720" w:gutter="0"/>
       <w:pgNumType w:start="1"/>
@@ -3167,6 +4018,27 @@
     <w:name w:val="Normal"/>
     <w:qFormat/>
   </w:style>
+  <w:style w:type="paragraph" w:styleId="Ttulo1">
+    <w:name w:val="heading 1"/>
+    <w:basedOn w:val="Normal"/>
+    <w:next w:val="Normal"/>
+    <w:link w:val="Ttulo1Char"/>
+    <w:uiPriority w:val="9"/>
+    <w:qFormat/>
+    <w:rsid w:val="004F5FED"/>
+    <w:pPr>
+      <w:keepNext/>
+      <w:keepLines/>
+      <w:spacing w:before="240" w:after="0"/>
+      <w:outlineLvl w:val="0"/>
+    </w:pPr>
+    <w:rPr>
+      <w:rFonts w:asciiTheme="majorHAnsi" w:eastAsiaTheme="majorEastAsia" w:hAnsiTheme="majorHAnsi" w:cstheme="majorBidi"/>
+      <w:color w:val="0F4761" w:themeColor="accent1" w:themeShade="BF"/>
+      <w:sz w:val="32"/>
+      <w:szCs w:val="32"/>
+    </w:rPr>
+  </w:style>
   <w:style w:type="character" w:default="1" w:styleId="Fontepargpadro">
     <w:name w:val="Default Paragraph Font"/>
     <w:uiPriority w:val="1"/>
@@ -3283,6 +4155,91 @@
         <w:insideV w:val="single" w:sz="4" w:space="0" w:color="000000" w:themeColor="text1"/>
       </w:tblBorders>
     </w:tblPr>
+  </w:style>
+  <w:style w:type="character" w:customStyle="1" w:styleId="Ttulo1Char">
+    <w:name w:val="Título 1 Char"/>
+    <w:basedOn w:val="Fontepargpadro"/>
+    <w:link w:val="Ttulo1"/>
+    <w:uiPriority w:val="9"/>
+    <w:rsid w:val="004F5FED"/>
+    <w:rPr>
+      <w:rFonts w:asciiTheme="majorHAnsi" w:eastAsiaTheme="majorEastAsia" w:hAnsiTheme="majorHAnsi" w:cstheme="majorBidi"/>
+      <w:color w:val="0F4761" w:themeColor="accent1" w:themeShade="BF"/>
+      <w:sz w:val="32"/>
+      <w:szCs w:val="32"/>
+    </w:rPr>
+  </w:style>
+  <w:style w:type="paragraph" w:styleId="CabealhodoSumrio">
+    <w:name w:val="TOC Heading"/>
+    <w:basedOn w:val="Ttulo1"/>
+    <w:next w:val="Normal"/>
+    <w:uiPriority w:val="39"/>
+    <w:unhideWhenUsed/>
+    <w:qFormat/>
+    <w:rsid w:val="004F5FED"/>
+    <w:pPr>
+      <w:spacing w:line="259" w:lineRule="auto"/>
+      <w:outlineLvl w:val="9"/>
+    </w:pPr>
+    <w:rPr>
+      <w:lang w:eastAsia="pt-BR"/>
+    </w:rPr>
+  </w:style>
+  <w:style w:type="paragraph" w:styleId="Sumrio2">
+    <w:name w:val="toc 2"/>
+    <w:basedOn w:val="Normal"/>
+    <w:next w:val="Normal"/>
+    <w:autoRedefine/>
+    <w:uiPriority w:val="39"/>
+    <w:unhideWhenUsed/>
+    <w:rsid w:val="004F5FED"/>
+    <w:pPr>
+      <w:spacing w:after="100" w:line="259" w:lineRule="auto"/>
+      <w:ind w:left="220"/>
+    </w:pPr>
+    <w:rPr>
+      <w:rFonts w:eastAsiaTheme="minorEastAsia" w:cs="Times New Roman"/>
+      <w:sz w:val="22"/>
+      <w:szCs w:val="22"/>
+      <w:lang w:eastAsia="pt-BR"/>
+    </w:rPr>
+  </w:style>
+  <w:style w:type="paragraph" w:styleId="Sumrio1">
+    <w:name w:val="toc 1"/>
+    <w:basedOn w:val="Normal"/>
+    <w:next w:val="Normal"/>
+    <w:autoRedefine/>
+    <w:uiPriority w:val="39"/>
+    <w:unhideWhenUsed/>
+    <w:rsid w:val="004F5FED"/>
+    <w:pPr>
+      <w:spacing w:after="100" w:line="259" w:lineRule="auto"/>
+    </w:pPr>
+    <w:rPr>
+      <w:rFonts w:eastAsiaTheme="minorEastAsia" w:cs="Times New Roman"/>
+      <w:sz w:val="22"/>
+      <w:szCs w:val="22"/>
+      <w:lang w:eastAsia="pt-BR"/>
+    </w:rPr>
+  </w:style>
+  <w:style w:type="paragraph" w:styleId="Sumrio3">
+    <w:name w:val="toc 3"/>
+    <w:basedOn w:val="Normal"/>
+    <w:next w:val="Normal"/>
+    <w:autoRedefine/>
+    <w:uiPriority w:val="39"/>
+    <w:unhideWhenUsed/>
+    <w:rsid w:val="004F5FED"/>
+    <w:pPr>
+      <w:spacing w:after="100" w:line="259" w:lineRule="auto"/>
+      <w:ind w:left="440"/>
+    </w:pPr>
+    <w:rPr>
+      <w:rFonts w:eastAsiaTheme="minorEastAsia" w:cs="Times New Roman"/>
+      <w:sz w:val="22"/>
+      <w:szCs w:val="22"/>
+      <w:lang w:eastAsia="pt-BR"/>
+    </w:rPr>
   </w:style>
 </w:styles>
 </file>
@@ -3546,4 +4503,16 @@
     </a:ext>
   </a:extLst>
 </a:theme>
+</file>
+
+<file path=customXml/item1.xml><?xml version="1.0" encoding="utf-8"?>
+<b:Sources xmlns:b="http://schemas.openxmlformats.org/officeDocument/2006/bibliography" xmlns="http://schemas.openxmlformats.org/officeDocument/2006/bibliography" SelectedStyle="\APASixthEditionOfficeOnline.xsl" StyleName="APA" Version="6"/>
+</file>
+
+<file path=customXml/itemProps1.xml><?xml version="1.0" encoding="utf-8"?>
+<ds:datastoreItem xmlns:ds="http://schemas.openxmlformats.org/officeDocument/2006/customXml" ds:itemID="{B1966278-7B1C-4E7B-9232-CAD24DC37BC0}">
+  <ds:schemaRefs>
+    <ds:schemaRef ds:uri="http://schemas.openxmlformats.org/officeDocument/2006/bibliography"/>
+  </ds:schemaRefs>
+</ds:datastoreItem>
 </file>
</xml_diff>